<commit_message>
Versión con mejoras en el patrocinio y el plan individual
</commit_message>
<xml_diff>
--- a/doc/patrocinio.docx
+++ b/doc/patrocinio.docx
@@ -1,6 +1,6 @@
 
 <file path=word/document.xml><?xml version="1.0" encoding="utf-8"?>
-<w:document xmlns:wpc="http://schemas.microsoft.com/office/word/2010/wordprocessingCanvas" xmlns:cx="http://schemas.microsoft.com/office/drawing/2014/chartex" xmlns:cx1="http://schemas.microsoft.com/office/drawing/2015/9/8/chartex" xmlns:cx2="http://schemas.microsoft.com/office/drawing/2015/10/21/chartex" xmlns:cx3="http://schemas.microsoft.com/office/drawing/2016/5/9/chartex" xmlns:cx4="http://schemas.microsoft.com/office/drawing/2016/5/10/chartex" xmlns:cx5="http://schemas.microsoft.com/office/drawing/2016/5/11/chartex" xmlns:cx6="http://schemas.microsoft.com/office/drawing/2016/5/12/chartex" xmlns:cx7="http://schemas.microsoft.com/office/drawing/2016/5/13/chartex" xmlns:cx8="http://schemas.microsoft.com/office/drawing/2016/5/14/chartex" xmlns:mc="http://schemas.openxmlformats.org/markup-compatibility/2006" xmlns:aink="http://schemas.microsoft.com/office/drawing/2016/ink" xmlns:am3d="http://schemas.microsoft.com/office/drawing/2017/model3d" xmlns:o="urn:schemas-microsoft-com:office:office" xmlns:oel="http://schemas.microsoft.com/office/2019/extlst" xmlns:r="http://schemas.openxmlformats.org/officeDocument/2006/relationships" xmlns:m="http://schemas.openxmlformats.org/officeDocument/2006/math" xmlns:v="urn:schemas-microsoft-com:vml" xmlns:wp14="http://schemas.microsoft.com/office/word/2010/wordprocessingDrawing" xmlns:wp="http://schemas.openxmlformats.org/drawingml/2006/wordprocessingDrawing" xmlns:w10="urn:schemas-microsoft-com:office:word" xmlns:w="http://schemas.openxmlformats.org/wordprocessingml/2006/main" xmlns:w14="http://schemas.microsoft.com/office/word/2010/wordml" xmlns:w15="http://schemas.microsoft.com/office/word/2012/wordml" xmlns:w16cex="http://schemas.microsoft.com/office/word/2018/wordml/cex" xmlns:w16cid="http://schemas.microsoft.com/office/word/2016/wordml/cid" xmlns:w16="http://schemas.microsoft.com/office/word/2018/wordml" xmlns:w16du="http://schemas.microsoft.com/office/word/2023/wordml/word16du" xmlns:w16sdtdh="http://schemas.microsoft.com/office/word/2020/wordml/sdtdatahash" xmlns:w16sdtfl="http://schemas.microsoft.com/office/word/2024/wordml/sdtformatlock" xmlns:w16se="http://schemas.microsoft.com/office/word/2015/wordml/symex" xmlns:wpg="http://schemas.microsoft.com/office/word/2010/wordprocessingGroup" xmlns:wpi="http://schemas.microsoft.com/office/word/2010/wordprocessingInk" xmlns:wne="http://schemas.microsoft.com/office/word/2006/wordml" xmlns:wps="http://schemas.microsoft.com/office/word/2010/wordprocessingShape" mc:Ignorable="w14 w15 w16se w16cid w16 w16cex w16sdtdh w16sdtfl w16du wp14">
+<w:document xmlns:wpc="http://schemas.microsoft.com/office/word/2010/wordprocessingCanvas" xmlns:cx="http://schemas.microsoft.com/office/drawing/2014/chartex" xmlns:cx1="http://schemas.microsoft.com/office/drawing/2015/9/8/chartex" xmlns:cx2="http://schemas.microsoft.com/office/drawing/2015/10/21/chartex" xmlns:cx3="http://schemas.microsoft.com/office/drawing/2016/5/9/chartex" xmlns:cx4="http://schemas.microsoft.com/office/drawing/2016/5/10/chartex" xmlns:cx5="http://schemas.microsoft.com/office/drawing/2016/5/11/chartex" xmlns:cx6="http://schemas.microsoft.com/office/drawing/2016/5/12/chartex" xmlns:cx7="http://schemas.microsoft.com/office/drawing/2016/5/13/chartex" xmlns:cx8="http://schemas.microsoft.com/office/drawing/2016/5/14/chartex" xmlns:mc="http://schemas.openxmlformats.org/markup-compatibility/2006" xmlns:aink="http://schemas.microsoft.com/office/drawing/2016/ink" xmlns:am3d="http://schemas.microsoft.com/office/drawing/2017/model3d" xmlns:o="urn:schemas-microsoft-com:office:office" xmlns:r="http://schemas.openxmlformats.org/officeDocument/2006/relationships" xmlns:m="http://schemas.openxmlformats.org/officeDocument/2006/math" xmlns:v="urn:schemas-microsoft-com:vml" xmlns:wp14="http://schemas.microsoft.com/office/word/2010/wordprocessingDrawing" xmlns:wp="http://schemas.openxmlformats.org/drawingml/2006/wordprocessingDrawing" xmlns:w10="urn:schemas-microsoft-com:office:word" xmlns:w="http://schemas.openxmlformats.org/wordprocessingml/2006/main" xmlns:w14="http://schemas.microsoft.com/office/word/2010/wordml" xmlns:w15="http://schemas.microsoft.com/office/word/2012/wordml" xmlns:w16cid="http://schemas.microsoft.com/office/word/2016/wordml/cid" xmlns:w16se="http://schemas.microsoft.com/office/word/2015/wordml/symex" xmlns:wpg="http://schemas.microsoft.com/office/word/2010/wordprocessingGroup" xmlns:wpi="http://schemas.microsoft.com/office/word/2010/wordprocessingInk" xmlns:wne="http://schemas.microsoft.com/office/word/2006/wordml" xmlns:wps="http://schemas.microsoft.com/office/word/2010/wordprocessingShape" mc:Ignorable="w14 w15 w16se w16cid wp14">
   <w:body>
     <w:p/>
     <w:p/>
@@ -80,9 +80,9 @@
                               <w:tblLook w:val="0000" w:firstRow="0" w:lastRow="0" w:firstColumn="0" w:lastColumn="0" w:noHBand="0" w:noVBand="0"/>
                             </w:tblPr>
                             <w:tblGrid>
-                              <w:gridCol w:w="2969"/>
-                              <w:gridCol w:w="5893"/>
-                              <w:gridCol w:w="2199"/>
+                              <w:gridCol w:w="2965"/>
+                              <w:gridCol w:w="5885"/>
+                              <w:gridCol w:w="2196"/>
                             </w:tblGrid>
                             <w:tr>
                               <w:trPr>
@@ -499,7 +499,7 @@
                 <v:stroke joinstyle="miter"/>
                 <v:path gradientshapeok="t" o:connecttype="rect"/>
               </v:shapetype>
-              <v:shape id="ctc1" o:spid="_x0000_s1026" type="#_x0000_t202" style="position:absolute;margin-left:0;margin-top:-28.35pt;width:595.3pt;height:127.55pt;z-index:251659264;visibility:visible;mso-wrap-style:square;mso-width-percent:0;mso-height-percent:0;mso-wrap-distance-left:9pt;mso-wrap-distance-top:0;mso-wrap-distance-right:9pt;mso-wrap-distance-bottom:0;mso-position-horizontal:center;mso-position-horizontal-relative:page;mso-position-vertical:absolute;mso-position-vertical-relative:margin;mso-width-percent:0;mso-height-percent:0;mso-width-relative:margin;mso-height-relative:margin;v-text-anchor:top" o:gfxdata="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" o:allowoverlap="f" fillcolor="white [3201]" stroked="f" strokeweight=".5pt">
+              <v:shape id="ctc1" o:spid="_x0000_s1026" type="#_x0000_t202" style="position:absolute;margin-left:0;margin-top:-28.35pt;width:595.3pt;height:127.55pt;z-index:251659264;visibility:visible;mso-wrap-style:square;mso-width-percent:0;mso-height-percent:0;mso-wrap-distance-left:9pt;mso-wrap-distance-top:0;mso-wrap-distance-right:9pt;mso-wrap-distance-bottom:0;mso-position-horizontal:center;mso-position-horizontal-relative:page;mso-position-vertical:absolute;mso-position-vertical-relative:margin;mso-width-percent:0;mso-height-percent:0;mso-width-relative:margin;mso-height-relative:margin;v-text-anchor:top" o:gfxdata="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" o:allowoverlap="f" fillcolor="white [3201]" stroked="f" strokeweight=".5pt">
                 <v:textbox>
                   <w:txbxContent>
                     <w:tbl>
@@ -521,9 +521,9 @@
                         <w:tblLook w:val="0000" w:firstRow="0" w:lastRow="0" w:firstColumn="0" w:lastColumn="0" w:noHBand="0" w:noVBand="0"/>
                       </w:tblPr>
                       <w:tblGrid>
-                        <w:gridCol w:w="2969"/>
-                        <w:gridCol w:w="5893"/>
-                        <w:gridCol w:w="2199"/>
+                        <w:gridCol w:w="2965"/>
+                        <w:gridCol w:w="5885"/>
+                        <w:gridCol w:w="2196"/>
                       </w:tblGrid>
                       <w:tr>
                         <w:trPr>
@@ -1169,13 +1169,14 @@
                                     </w:rPr>
                                   </w:pPr>
                                   <w:bookmarkStart w:id="0" w:name="_Hlk168652179"/>
+                                  <w:bookmarkStart w:id="1" w:name="_GoBack" w:colFirst="0" w:colLast="2"/>
                                   <w:r>
                                     <w:rPr>
                                       <w:rFonts w:ascii="Arial" w:hAnsi="Arial" w:cs="Arial"/>
                                       <w:sz w:val="18"/>
                                       <w:szCs w:val="18"/>
                                     </w:rPr>
-                                    <w:t>ELABORADO</w:t>
+                                    <w:t>Elaborado</w:t>
                                   </w:r>
                                   <w:r>
                                     <w:rPr>
@@ -1192,7 +1193,7 @@
                                       <w:sz w:val="18"/>
                                       <w:szCs w:val="18"/>
                                     </w:rPr>
-                                    <w:t>POR:</w:t>
+                                    <w:t>Por:</w:t>
                                   </w:r>
                                 </w:p>
                                 <w:p>
@@ -1267,7 +1268,7 @@
                                       <w:sz w:val="18"/>
                                       <w:szCs w:val="18"/>
                                     </w:rPr>
-                                    <w:t>APROBADO</w:t>
+                                    <w:t>Aprobado</w:t>
                                   </w:r>
                                   <w:r>
                                     <w:rPr>
@@ -1284,11 +1285,12 @@
                                       <w:sz w:val="18"/>
                                       <w:szCs w:val="18"/>
                                     </w:rPr>
-                                    <w:t>POR:</w:t>
+                                    <w:t>Por:</w:t>
                                   </w:r>
                                 </w:p>
                               </w:tc>
                             </w:tr>
+                            <w:bookmarkEnd w:id="1"/>
                             <w:tr>
                               <w:trPr>
                                 <w:trHeight w:val="266"/>
@@ -1575,7 +1577,34 @@
                                       <w:spacing w:val="-2"/>
                                       <w:sz w:val="18"/>
                                     </w:rPr>
-                                    <w:t>Gestor de Carreras</w:t>
+                                    <w:t xml:space="preserve">Gestor de </w:t>
+                                  </w:r>
+                                  <w:r>
+                                    <w:rPr>
+                                      <w:rFonts w:ascii="Arial"/>
+                                      <w:b/>
+                                      <w:spacing w:val="-2"/>
+                                      <w:sz w:val="18"/>
+                                    </w:rPr>
+                                    <w:t>Procesos Acad</w:t>
+                                  </w:r>
+                                  <w:r>
+                                    <w:rPr>
+                                      <w:rFonts w:ascii="Arial"/>
+                                      <w:b/>
+                                      <w:spacing w:val="-2"/>
+                                      <w:sz w:val="18"/>
+                                    </w:rPr>
+                                    <w:t>é</w:t>
+                                  </w:r>
+                                  <w:r>
+                                    <w:rPr>
+                                      <w:rFonts w:ascii="Arial"/>
+                                      <w:b/>
+                                      <w:spacing w:val="-2"/>
+                                      <w:sz w:val="18"/>
+                                    </w:rPr>
+                                    <w:t>micos</w:t>
                                   </w:r>
                                 </w:p>
                               </w:tc>
@@ -1650,7 +1679,7 @@
           </mc:Choice>
           <mc:Fallback>
             <w:pict>
-              <v:shape w14:anchorId="6DD83CFD" id="_x0000_s1027" type="#_x0000_t202" style="position:absolute;margin-left:14pt;margin-top:595.35pt;width:566.9pt;height:127pt;z-index:251661312;visibility:visible;mso-wrap-style:square;mso-width-percent:0;mso-height-percent:0;mso-wrap-distance-left:9pt;mso-wrap-distance-top:0;mso-wrap-distance-right:9pt;mso-wrap-distance-bottom:0;mso-position-horizontal:absolute;mso-position-horizontal-relative:page;mso-position-vertical:absolute;mso-position-vertical-relative:margin;mso-width-percent:0;mso-height-percent:0;mso-width-relative:margin;mso-height-relative:margin;v-text-anchor:top" o:gfxdata="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" o:allowoverlap="f" fillcolor="white [3201]" stroked="f" strokeweight=".5pt">
+              <v:shape w14:anchorId="6DD83CFD" id="_x0000_s1027" type="#_x0000_t202" style="position:absolute;margin-left:14pt;margin-top:595.35pt;width:566.9pt;height:127pt;z-index:251661312;visibility:visible;mso-wrap-style:square;mso-width-percent:0;mso-height-percent:0;mso-wrap-distance-left:9pt;mso-wrap-distance-top:0;mso-wrap-distance-right:9pt;mso-wrap-distance-bottom:0;mso-position-horizontal:absolute;mso-position-horizontal-relative:page;mso-position-vertical:absolute;mso-position-vertical-relative:margin;mso-width-percent:0;mso-height-percent:0;mso-width-relative:margin;mso-height-relative:margin;v-text-anchor:top" o:gfxdata="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" o:allowoverlap="f" fillcolor="white [3201]" stroked="f" strokeweight=".5pt">
                 <v:textbox>
                   <w:txbxContent>
                     <w:tbl>
@@ -1694,14 +1723,15 @@
                                 <w:szCs w:val="18"/>
                               </w:rPr>
                             </w:pPr>
-                            <w:bookmarkStart w:id="1" w:name="_Hlk168652179"/>
+                            <w:bookmarkStart w:id="2" w:name="_Hlk168652179"/>
+                            <w:bookmarkStart w:id="3" w:name="_GoBack" w:colFirst="0" w:colLast="2"/>
                             <w:r>
                               <w:rPr>
                                 <w:rFonts w:ascii="Arial" w:hAnsi="Arial" w:cs="Arial"/>
                                 <w:sz w:val="18"/>
                                 <w:szCs w:val="18"/>
                               </w:rPr>
-                              <w:t>ELABORADO</w:t>
+                              <w:t>Elaborado</w:t>
                             </w:r>
                             <w:r>
                               <w:rPr>
@@ -1718,7 +1748,7 @@
                                 <w:sz w:val="18"/>
                                 <w:szCs w:val="18"/>
                               </w:rPr>
-                              <w:t>POR:</w:t>
+                              <w:t>Por:</w:t>
                             </w:r>
                           </w:p>
                           <w:p>
@@ -1793,7 +1823,7 @@
                                 <w:sz w:val="18"/>
                                 <w:szCs w:val="18"/>
                               </w:rPr>
-                              <w:t>APROBADO</w:t>
+                              <w:t>Aprobado</w:t>
                             </w:r>
                             <w:r>
                               <w:rPr>
@@ -1810,11 +1840,12 @@
                                 <w:sz w:val="18"/>
                                 <w:szCs w:val="18"/>
                               </w:rPr>
-                              <w:t>POR:</w:t>
+                              <w:t>Por:</w:t>
                             </w:r>
                           </w:p>
                         </w:tc>
                       </w:tr>
+                      <w:bookmarkEnd w:id="3"/>
                       <w:tr>
                         <w:trPr>
                           <w:trHeight w:val="266"/>
@@ -2101,7 +2132,34 @@
                                 <w:spacing w:val="-2"/>
                                 <w:sz w:val="18"/>
                               </w:rPr>
-                              <w:t>Gestor de Carreras</w:t>
+                              <w:t xml:space="preserve">Gestor de </w:t>
+                            </w:r>
+                            <w:r>
+                              <w:rPr>
+                                <w:rFonts w:ascii="Arial"/>
+                                <w:b/>
+                                <w:spacing w:val="-2"/>
+                                <w:sz w:val="18"/>
+                              </w:rPr>
+                              <w:t>Procesos Acad</w:t>
+                            </w:r>
+                            <w:r>
+                              <w:rPr>
+                                <w:rFonts w:ascii="Arial"/>
+                                <w:b/>
+                                <w:spacing w:val="-2"/>
+                                <w:sz w:val="18"/>
+                              </w:rPr>
+                              <w:t>é</w:t>
+                            </w:r>
+                            <w:r>
+                              <w:rPr>
+                                <w:rFonts w:ascii="Arial"/>
+                                <w:b/>
+                                <w:spacing w:val="-2"/>
+                                <w:sz w:val="18"/>
+                              </w:rPr>
+                              <w:t>micos</w:t>
                             </w:r>
                           </w:p>
                         </w:tc>
@@ -2151,7 +2209,7 @@
                           </w:p>
                         </w:tc>
                       </w:tr>
-                      <w:bookmarkEnd w:id="1"/>
+                      <w:bookmarkEnd w:id="2"/>
                     </w:tbl>
                     <w:p/>
                   </w:txbxContent>
@@ -3316,7 +3374,7 @@
 </file>
 
 <file path=word/endnotes.xml><?xml version="1.0" encoding="utf-8"?>
-<w:endnotes xmlns:wpc="http://schemas.microsoft.com/office/word/2010/wordprocessingCanvas" xmlns:cx="http://schemas.microsoft.com/office/drawing/2014/chartex" xmlns:cx1="http://schemas.microsoft.com/office/drawing/2015/9/8/chartex" xmlns:cx2="http://schemas.microsoft.com/office/drawing/2015/10/21/chartex" xmlns:cx3="http://schemas.microsoft.com/office/drawing/2016/5/9/chartex" xmlns:cx4="http://schemas.microsoft.com/office/drawing/2016/5/10/chartex" xmlns:cx5="http://schemas.microsoft.com/office/drawing/2016/5/11/chartex" xmlns:cx6="http://schemas.microsoft.com/office/drawing/2016/5/12/chartex" xmlns:cx7="http://schemas.microsoft.com/office/drawing/2016/5/13/chartex" xmlns:cx8="http://schemas.microsoft.com/office/drawing/2016/5/14/chartex" xmlns:mc="http://schemas.openxmlformats.org/markup-compatibility/2006" xmlns:aink="http://schemas.microsoft.com/office/drawing/2016/ink" xmlns:am3d="http://schemas.microsoft.com/office/drawing/2017/model3d" xmlns:o="urn:schemas-microsoft-com:office:office" xmlns:oel="http://schemas.microsoft.com/office/2019/extlst" xmlns:r="http://schemas.openxmlformats.org/officeDocument/2006/relationships" xmlns:m="http://schemas.openxmlformats.org/officeDocument/2006/math" xmlns:v="urn:schemas-microsoft-com:vml" xmlns:wp14="http://schemas.microsoft.com/office/word/2010/wordprocessingDrawing" xmlns:wp="http://schemas.openxmlformats.org/drawingml/2006/wordprocessingDrawing" xmlns:w10="urn:schemas-microsoft-com:office:word" xmlns:w="http://schemas.openxmlformats.org/wordprocessingml/2006/main" xmlns:w14="http://schemas.microsoft.com/office/word/2010/wordml" xmlns:w15="http://schemas.microsoft.com/office/word/2012/wordml" xmlns:w16cex="http://schemas.microsoft.com/office/word/2018/wordml/cex" xmlns:w16cid="http://schemas.microsoft.com/office/word/2016/wordml/cid" xmlns:w16="http://schemas.microsoft.com/office/word/2018/wordml" xmlns:w16du="http://schemas.microsoft.com/office/word/2023/wordml/word16du" xmlns:w16sdtdh="http://schemas.microsoft.com/office/word/2020/wordml/sdtdatahash" xmlns:w16sdtfl="http://schemas.microsoft.com/office/word/2024/wordml/sdtformatlock" xmlns:w16se="http://schemas.microsoft.com/office/word/2015/wordml/symex" xmlns:wpg="http://schemas.microsoft.com/office/word/2010/wordprocessingGroup" xmlns:wpi="http://schemas.microsoft.com/office/word/2010/wordprocessingInk" xmlns:wne="http://schemas.microsoft.com/office/word/2006/wordml" xmlns:wps="http://schemas.microsoft.com/office/word/2010/wordprocessingShape" mc:Ignorable="w14 w15 w16se w16cid w16 w16cex w16sdtdh w16sdtfl w16du wp14">
+<w:endnotes xmlns:wpc="http://schemas.microsoft.com/office/word/2010/wordprocessingCanvas" xmlns:cx="http://schemas.microsoft.com/office/drawing/2014/chartex" xmlns:cx1="http://schemas.microsoft.com/office/drawing/2015/9/8/chartex" xmlns:cx2="http://schemas.microsoft.com/office/drawing/2015/10/21/chartex" xmlns:cx3="http://schemas.microsoft.com/office/drawing/2016/5/9/chartex" xmlns:cx4="http://schemas.microsoft.com/office/drawing/2016/5/10/chartex" xmlns:cx5="http://schemas.microsoft.com/office/drawing/2016/5/11/chartex" xmlns:cx6="http://schemas.microsoft.com/office/drawing/2016/5/12/chartex" xmlns:cx7="http://schemas.microsoft.com/office/drawing/2016/5/13/chartex" xmlns:cx8="http://schemas.microsoft.com/office/drawing/2016/5/14/chartex" xmlns:mc="http://schemas.openxmlformats.org/markup-compatibility/2006" xmlns:aink="http://schemas.microsoft.com/office/drawing/2016/ink" xmlns:am3d="http://schemas.microsoft.com/office/drawing/2017/model3d" xmlns:o="urn:schemas-microsoft-com:office:office" xmlns:r="http://schemas.openxmlformats.org/officeDocument/2006/relationships" xmlns:m="http://schemas.openxmlformats.org/officeDocument/2006/math" xmlns:v="urn:schemas-microsoft-com:vml" xmlns:wp14="http://schemas.microsoft.com/office/word/2010/wordprocessingDrawing" xmlns:wp="http://schemas.openxmlformats.org/drawingml/2006/wordprocessingDrawing" xmlns:w10="urn:schemas-microsoft-com:office:word" xmlns:w="http://schemas.openxmlformats.org/wordprocessingml/2006/main" xmlns:w14="http://schemas.microsoft.com/office/word/2010/wordml" xmlns:w15="http://schemas.microsoft.com/office/word/2012/wordml" xmlns:w16cid="http://schemas.microsoft.com/office/word/2016/wordml/cid" xmlns:w16se="http://schemas.microsoft.com/office/word/2015/wordml/symex" xmlns:wpg="http://schemas.microsoft.com/office/word/2010/wordprocessingGroup" xmlns:wpi="http://schemas.microsoft.com/office/word/2010/wordprocessingInk" xmlns:wne="http://schemas.microsoft.com/office/word/2006/wordml" xmlns:wps="http://schemas.microsoft.com/office/word/2010/wordprocessingShape" mc:Ignorable="w14 w15 w16se w16cid wp14">
   <w:endnote w:type="separator" w:id="-1">
     <w:p>
       <w:pPr>
@@ -3341,7 +3399,7 @@
 </file>
 
 <file path=word/footer1.xml><?xml version="1.0" encoding="utf-8"?>
-<w:ftr xmlns:wpc="http://schemas.microsoft.com/office/word/2010/wordprocessingCanvas" xmlns:cx="http://schemas.microsoft.com/office/drawing/2014/chartex" xmlns:cx1="http://schemas.microsoft.com/office/drawing/2015/9/8/chartex" xmlns:cx2="http://schemas.microsoft.com/office/drawing/2015/10/21/chartex" xmlns:cx3="http://schemas.microsoft.com/office/drawing/2016/5/9/chartex" xmlns:cx4="http://schemas.microsoft.com/office/drawing/2016/5/10/chartex" xmlns:cx5="http://schemas.microsoft.com/office/drawing/2016/5/11/chartex" xmlns:cx6="http://schemas.microsoft.com/office/drawing/2016/5/12/chartex" xmlns:cx7="http://schemas.microsoft.com/office/drawing/2016/5/13/chartex" xmlns:cx8="http://schemas.microsoft.com/office/drawing/2016/5/14/chartex" xmlns:mc="http://schemas.openxmlformats.org/markup-compatibility/2006" xmlns:aink="http://schemas.microsoft.com/office/drawing/2016/ink" xmlns:am3d="http://schemas.microsoft.com/office/drawing/2017/model3d" xmlns:o="urn:schemas-microsoft-com:office:office" xmlns:oel="http://schemas.microsoft.com/office/2019/extlst" xmlns:r="http://schemas.openxmlformats.org/officeDocument/2006/relationships" xmlns:m="http://schemas.openxmlformats.org/officeDocument/2006/math" xmlns:v="urn:schemas-microsoft-com:vml" xmlns:wp14="http://schemas.microsoft.com/office/word/2010/wordprocessingDrawing" xmlns:wp="http://schemas.openxmlformats.org/drawingml/2006/wordprocessingDrawing" xmlns:w10="urn:schemas-microsoft-com:office:word" xmlns:w="http://schemas.openxmlformats.org/wordprocessingml/2006/main" xmlns:w14="http://schemas.microsoft.com/office/word/2010/wordml" xmlns:w15="http://schemas.microsoft.com/office/word/2012/wordml" xmlns:w16cex="http://schemas.microsoft.com/office/word/2018/wordml/cex" xmlns:w16cid="http://schemas.microsoft.com/office/word/2016/wordml/cid" xmlns:w16="http://schemas.microsoft.com/office/word/2018/wordml" xmlns:w16du="http://schemas.microsoft.com/office/word/2023/wordml/word16du" xmlns:w16sdtdh="http://schemas.microsoft.com/office/word/2020/wordml/sdtdatahash" xmlns:w16sdtfl="http://schemas.microsoft.com/office/word/2024/wordml/sdtformatlock" xmlns:w16se="http://schemas.microsoft.com/office/word/2015/wordml/symex" xmlns:wpg="http://schemas.microsoft.com/office/word/2010/wordprocessingGroup" xmlns:wpi="http://schemas.microsoft.com/office/word/2010/wordprocessingInk" xmlns:wne="http://schemas.microsoft.com/office/word/2006/wordml" xmlns:wps="http://schemas.microsoft.com/office/word/2010/wordprocessingShape" mc:Ignorable="w14 w15 w16se w16cid w16 w16cex w16sdtdh w16sdtfl w16du wp14">
+<w:ftr xmlns:wpc="http://schemas.microsoft.com/office/word/2010/wordprocessingCanvas" xmlns:cx="http://schemas.microsoft.com/office/drawing/2014/chartex" xmlns:cx1="http://schemas.microsoft.com/office/drawing/2015/9/8/chartex" xmlns:cx2="http://schemas.microsoft.com/office/drawing/2015/10/21/chartex" xmlns:cx3="http://schemas.microsoft.com/office/drawing/2016/5/9/chartex" xmlns:cx4="http://schemas.microsoft.com/office/drawing/2016/5/10/chartex" xmlns:cx5="http://schemas.microsoft.com/office/drawing/2016/5/11/chartex" xmlns:cx6="http://schemas.microsoft.com/office/drawing/2016/5/12/chartex" xmlns:cx7="http://schemas.microsoft.com/office/drawing/2016/5/13/chartex" xmlns:cx8="http://schemas.microsoft.com/office/drawing/2016/5/14/chartex" xmlns:mc="http://schemas.openxmlformats.org/markup-compatibility/2006" xmlns:aink="http://schemas.microsoft.com/office/drawing/2016/ink" xmlns:am3d="http://schemas.microsoft.com/office/drawing/2017/model3d" xmlns:o="urn:schemas-microsoft-com:office:office" xmlns:r="http://schemas.openxmlformats.org/officeDocument/2006/relationships" xmlns:m="http://schemas.openxmlformats.org/officeDocument/2006/math" xmlns:v="urn:schemas-microsoft-com:vml" xmlns:wp14="http://schemas.microsoft.com/office/word/2010/wordprocessingDrawing" xmlns:wp="http://schemas.openxmlformats.org/drawingml/2006/wordprocessingDrawing" xmlns:w10="urn:schemas-microsoft-com:office:word" xmlns:w="http://schemas.openxmlformats.org/wordprocessingml/2006/main" xmlns:w14="http://schemas.microsoft.com/office/word/2010/wordml" xmlns:w15="http://schemas.microsoft.com/office/word/2012/wordml" xmlns:w16cid="http://schemas.microsoft.com/office/word/2016/wordml/cid" xmlns:w16se="http://schemas.microsoft.com/office/word/2015/wordml/symex" xmlns:wpg="http://schemas.microsoft.com/office/word/2010/wordprocessingGroup" xmlns:wpi="http://schemas.microsoft.com/office/word/2010/wordprocessingInk" xmlns:wne="http://schemas.microsoft.com/office/word/2006/wordml" xmlns:wps="http://schemas.microsoft.com/office/word/2010/wordprocessingShape" mc:Ignorable="w14 w15 w16se w16cid wp14">
   <w:p>
     <w:pPr>
       <w:pStyle w:val="Piedepgina"/>
@@ -3461,7 +3519,7 @@
 </file>
 
 <file path=word/footer2.xml><?xml version="1.0" encoding="utf-8"?>
-<w:ftr xmlns:wpc="http://schemas.microsoft.com/office/word/2010/wordprocessingCanvas" xmlns:cx="http://schemas.microsoft.com/office/drawing/2014/chartex" xmlns:cx1="http://schemas.microsoft.com/office/drawing/2015/9/8/chartex" xmlns:cx2="http://schemas.microsoft.com/office/drawing/2015/10/21/chartex" xmlns:cx3="http://schemas.microsoft.com/office/drawing/2016/5/9/chartex" xmlns:cx4="http://schemas.microsoft.com/office/drawing/2016/5/10/chartex" xmlns:cx5="http://schemas.microsoft.com/office/drawing/2016/5/11/chartex" xmlns:cx6="http://schemas.microsoft.com/office/drawing/2016/5/12/chartex" xmlns:cx7="http://schemas.microsoft.com/office/drawing/2016/5/13/chartex" xmlns:cx8="http://schemas.microsoft.com/office/drawing/2016/5/14/chartex" xmlns:mc="http://schemas.openxmlformats.org/markup-compatibility/2006" xmlns:aink="http://schemas.microsoft.com/office/drawing/2016/ink" xmlns:am3d="http://schemas.microsoft.com/office/drawing/2017/model3d" xmlns:o="urn:schemas-microsoft-com:office:office" xmlns:oel="http://schemas.microsoft.com/office/2019/extlst" xmlns:r="http://schemas.openxmlformats.org/officeDocument/2006/relationships" xmlns:m="http://schemas.openxmlformats.org/officeDocument/2006/math" xmlns:v="urn:schemas-microsoft-com:vml" xmlns:wp14="http://schemas.microsoft.com/office/word/2010/wordprocessingDrawing" xmlns:wp="http://schemas.openxmlformats.org/drawingml/2006/wordprocessingDrawing" xmlns:w10="urn:schemas-microsoft-com:office:word" xmlns:w="http://schemas.openxmlformats.org/wordprocessingml/2006/main" xmlns:w14="http://schemas.microsoft.com/office/word/2010/wordml" xmlns:w15="http://schemas.microsoft.com/office/word/2012/wordml" xmlns:w16cex="http://schemas.microsoft.com/office/word/2018/wordml/cex" xmlns:w16cid="http://schemas.microsoft.com/office/word/2016/wordml/cid" xmlns:w16="http://schemas.microsoft.com/office/word/2018/wordml" xmlns:w16du="http://schemas.microsoft.com/office/word/2023/wordml/word16du" xmlns:w16sdtdh="http://schemas.microsoft.com/office/word/2020/wordml/sdtdatahash" xmlns:w16sdtfl="http://schemas.microsoft.com/office/word/2024/wordml/sdtformatlock" xmlns:w16se="http://schemas.microsoft.com/office/word/2015/wordml/symex" xmlns:wpg="http://schemas.microsoft.com/office/word/2010/wordprocessingGroup" xmlns:wpi="http://schemas.microsoft.com/office/word/2010/wordprocessingInk" xmlns:wne="http://schemas.microsoft.com/office/word/2006/wordml" xmlns:wps="http://schemas.microsoft.com/office/word/2010/wordprocessingShape" mc:Ignorable="w14 w15 w16se w16cid w16 w16cex w16sdtdh w16sdtfl w16du wp14">
+<w:ftr xmlns:wpc="http://schemas.microsoft.com/office/word/2010/wordprocessingCanvas" xmlns:cx="http://schemas.microsoft.com/office/drawing/2014/chartex" xmlns:cx1="http://schemas.microsoft.com/office/drawing/2015/9/8/chartex" xmlns:cx2="http://schemas.microsoft.com/office/drawing/2015/10/21/chartex" xmlns:cx3="http://schemas.microsoft.com/office/drawing/2016/5/9/chartex" xmlns:cx4="http://schemas.microsoft.com/office/drawing/2016/5/10/chartex" xmlns:cx5="http://schemas.microsoft.com/office/drawing/2016/5/11/chartex" xmlns:cx6="http://schemas.microsoft.com/office/drawing/2016/5/12/chartex" xmlns:cx7="http://schemas.microsoft.com/office/drawing/2016/5/13/chartex" xmlns:cx8="http://schemas.microsoft.com/office/drawing/2016/5/14/chartex" xmlns:mc="http://schemas.openxmlformats.org/markup-compatibility/2006" xmlns:aink="http://schemas.microsoft.com/office/drawing/2016/ink" xmlns:am3d="http://schemas.microsoft.com/office/drawing/2017/model3d" xmlns:o="urn:schemas-microsoft-com:office:office" xmlns:r="http://schemas.openxmlformats.org/officeDocument/2006/relationships" xmlns:m="http://schemas.openxmlformats.org/officeDocument/2006/math" xmlns:v="urn:schemas-microsoft-com:vml" xmlns:wp14="http://schemas.microsoft.com/office/word/2010/wordprocessingDrawing" xmlns:wp="http://schemas.openxmlformats.org/drawingml/2006/wordprocessingDrawing" xmlns:w10="urn:schemas-microsoft-com:office:word" xmlns:w="http://schemas.openxmlformats.org/wordprocessingml/2006/main" xmlns:w14="http://schemas.microsoft.com/office/word/2010/wordml" xmlns:w15="http://schemas.microsoft.com/office/word/2012/wordml" xmlns:w16cid="http://schemas.microsoft.com/office/word/2016/wordml/cid" xmlns:w16se="http://schemas.microsoft.com/office/word/2015/wordml/symex" xmlns:wpg="http://schemas.microsoft.com/office/word/2010/wordprocessingGroup" xmlns:wpi="http://schemas.microsoft.com/office/word/2010/wordprocessingInk" xmlns:wne="http://schemas.microsoft.com/office/word/2006/wordml" xmlns:wps="http://schemas.microsoft.com/office/word/2010/wordprocessingShape" mc:Ignorable="w14 w15 w16se w16cid wp14">
   <w:p>
     <w:pPr>
       <w:pStyle w:val="Piedepgina"/>
@@ -3581,7 +3639,7 @@
 </file>
 
 <file path=word/footnotes.xml><?xml version="1.0" encoding="utf-8"?>
-<w:footnotes xmlns:wpc="http://schemas.microsoft.com/office/word/2010/wordprocessingCanvas" xmlns:cx="http://schemas.microsoft.com/office/drawing/2014/chartex" xmlns:cx1="http://schemas.microsoft.com/office/drawing/2015/9/8/chartex" xmlns:cx2="http://schemas.microsoft.com/office/drawing/2015/10/21/chartex" xmlns:cx3="http://schemas.microsoft.com/office/drawing/2016/5/9/chartex" xmlns:cx4="http://schemas.microsoft.com/office/drawing/2016/5/10/chartex" xmlns:cx5="http://schemas.microsoft.com/office/drawing/2016/5/11/chartex" xmlns:cx6="http://schemas.microsoft.com/office/drawing/2016/5/12/chartex" xmlns:cx7="http://schemas.microsoft.com/office/drawing/2016/5/13/chartex" xmlns:cx8="http://schemas.microsoft.com/office/drawing/2016/5/14/chartex" xmlns:mc="http://schemas.openxmlformats.org/markup-compatibility/2006" xmlns:aink="http://schemas.microsoft.com/office/drawing/2016/ink" xmlns:am3d="http://schemas.microsoft.com/office/drawing/2017/model3d" xmlns:o="urn:schemas-microsoft-com:office:office" xmlns:oel="http://schemas.microsoft.com/office/2019/extlst" xmlns:r="http://schemas.openxmlformats.org/officeDocument/2006/relationships" xmlns:m="http://schemas.openxmlformats.org/officeDocument/2006/math" xmlns:v="urn:schemas-microsoft-com:vml" xmlns:wp14="http://schemas.microsoft.com/office/word/2010/wordprocessingDrawing" xmlns:wp="http://schemas.openxmlformats.org/drawingml/2006/wordprocessingDrawing" xmlns:w10="urn:schemas-microsoft-com:office:word" xmlns:w="http://schemas.openxmlformats.org/wordprocessingml/2006/main" xmlns:w14="http://schemas.microsoft.com/office/word/2010/wordml" xmlns:w15="http://schemas.microsoft.com/office/word/2012/wordml" xmlns:w16cex="http://schemas.microsoft.com/office/word/2018/wordml/cex" xmlns:w16cid="http://schemas.microsoft.com/office/word/2016/wordml/cid" xmlns:w16="http://schemas.microsoft.com/office/word/2018/wordml" xmlns:w16du="http://schemas.microsoft.com/office/word/2023/wordml/word16du" xmlns:w16sdtdh="http://schemas.microsoft.com/office/word/2020/wordml/sdtdatahash" xmlns:w16sdtfl="http://schemas.microsoft.com/office/word/2024/wordml/sdtformatlock" xmlns:w16se="http://schemas.microsoft.com/office/word/2015/wordml/symex" xmlns:wpg="http://schemas.microsoft.com/office/word/2010/wordprocessingGroup" xmlns:wpi="http://schemas.microsoft.com/office/word/2010/wordprocessingInk" xmlns:wne="http://schemas.microsoft.com/office/word/2006/wordml" xmlns:wps="http://schemas.microsoft.com/office/word/2010/wordprocessingShape" mc:Ignorable="w14 w15 w16se w16cid w16 w16cex w16sdtdh w16sdtfl w16du wp14">
+<w:footnotes xmlns:wpc="http://schemas.microsoft.com/office/word/2010/wordprocessingCanvas" xmlns:cx="http://schemas.microsoft.com/office/drawing/2014/chartex" xmlns:cx1="http://schemas.microsoft.com/office/drawing/2015/9/8/chartex" xmlns:cx2="http://schemas.microsoft.com/office/drawing/2015/10/21/chartex" xmlns:cx3="http://schemas.microsoft.com/office/drawing/2016/5/9/chartex" xmlns:cx4="http://schemas.microsoft.com/office/drawing/2016/5/10/chartex" xmlns:cx5="http://schemas.microsoft.com/office/drawing/2016/5/11/chartex" xmlns:cx6="http://schemas.microsoft.com/office/drawing/2016/5/12/chartex" xmlns:cx7="http://schemas.microsoft.com/office/drawing/2016/5/13/chartex" xmlns:cx8="http://schemas.microsoft.com/office/drawing/2016/5/14/chartex" xmlns:mc="http://schemas.openxmlformats.org/markup-compatibility/2006" xmlns:aink="http://schemas.microsoft.com/office/drawing/2016/ink" xmlns:am3d="http://schemas.microsoft.com/office/drawing/2017/model3d" xmlns:o="urn:schemas-microsoft-com:office:office" xmlns:r="http://schemas.openxmlformats.org/officeDocument/2006/relationships" xmlns:m="http://schemas.openxmlformats.org/officeDocument/2006/math" xmlns:v="urn:schemas-microsoft-com:vml" xmlns:wp14="http://schemas.microsoft.com/office/word/2010/wordprocessingDrawing" xmlns:wp="http://schemas.openxmlformats.org/drawingml/2006/wordprocessingDrawing" xmlns:w10="urn:schemas-microsoft-com:office:word" xmlns:w="http://schemas.openxmlformats.org/wordprocessingml/2006/main" xmlns:w14="http://schemas.microsoft.com/office/word/2010/wordml" xmlns:w15="http://schemas.microsoft.com/office/word/2012/wordml" xmlns:w16cid="http://schemas.microsoft.com/office/word/2016/wordml/cid" xmlns:w16se="http://schemas.microsoft.com/office/word/2015/wordml/symex" xmlns:wpg="http://schemas.microsoft.com/office/word/2010/wordprocessingGroup" xmlns:wpi="http://schemas.microsoft.com/office/word/2010/wordprocessingInk" xmlns:wne="http://schemas.microsoft.com/office/word/2006/wordml" xmlns:wps="http://schemas.microsoft.com/office/word/2010/wordprocessingShape" mc:Ignorable="w14 w15 w16se w16cid wp14">
   <w:footnote w:type="separator" w:id="-1">
     <w:p>
       <w:pPr>
@@ -3606,7 +3664,7 @@
 </file>
 
 <file path=word/header1.xml><?xml version="1.0" encoding="utf-8"?>
-<w:hdr xmlns:wpc="http://schemas.microsoft.com/office/word/2010/wordprocessingCanvas" xmlns:cx="http://schemas.microsoft.com/office/drawing/2014/chartex" xmlns:cx1="http://schemas.microsoft.com/office/drawing/2015/9/8/chartex" xmlns:cx2="http://schemas.microsoft.com/office/drawing/2015/10/21/chartex" xmlns:cx3="http://schemas.microsoft.com/office/drawing/2016/5/9/chartex" xmlns:cx4="http://schemas.microsoft.com/office/drawing/2016/5/10/chartex" xmlns:cx5="http://schemas.microsoft.com/office/drawing/2016/5/11/chartex" xmlns:cx6="http://schemas.microsoft.com/office/drawing/2016/5/12/chartex" xmlns:cx7="http://schemas.microsoft.com/office/drawing/2016/5/13/chartex" xmlns:cx8="http://schemas.microsoft.com/office/drawing/2016/5/14/chartex" xmlns:mc="http://schemas.openxmlformats.org/markup-compatibility/2006" xmlns:aink="http://schemas.microsoft.com/office/drawing/2016/ink" xmlns:am3d="http://schemas.microsoft.com/office/drawing/2017/model3d" xmlns:o="urn:schemas-microsoft-com:office:office" xmlns:oel="http://schemas.microsoft.com/office/2019/extlst" xmlns:r="http://schemas.openxmlformats.org/officeDocument/2006/relationships" xmlns:m="http://schemas.openxmlformats.org/officeDocument/2006/math" xmlns:v="urn:schemas-microsoft-com:vml" xmlns:wp14="http://schemas.microsoft.com/office/word/2010/wordprocessingDrawing" xmlns:wp="http://schemas.openxmlformats.org/drawingml/2006/wordprocessingDrawing" xmlns:w10="urn:schemas-microsoft-com:office:word" xmlns:w="http://schemas.openxmlformats.org/wordprocessingml/2006/main" xmlns:w14="http://schemas.microsoft.com/office/word/2010/wordml" xmlns:w15="http://schemas.microsoft.com/office/word/2012/wordml" xmlns:w16cex="http://schemas.microsoft.com/office/word/2018/wordml/cex" xmlns:w16cid="http://schemas.microsoft.com/office/word/2016/wordml/cid" xmlns:w16="http://schemas.microsoft.com/office/word/2018/wordml" xmlns:w16du="http://schemas.microsoft.com/office/word/2023/wordml/word16du" xmlns:w16sdtdh="http://schemas.microsoft.com/office/word/2020/wordml/sdtdatahash" xmlns:w16sdtfl="http://schemas.microsoft.com/office/word/2024/wordml/sdtformatlock" xmlns:w16se="http://schemas.microsoft.com/office/word/2015/wordml/symex" xmlns:wpg="http://schemas.microsoft.com/office/word/2010/wordprocessingGroup" xmlns:wpi="http://schemas.microsoft.com/office/word/2010/wordprocessingInk" xmlns:wne="http://schemas.microsoft.com/office/word/2006/wordml" xmlns:wps="http://schemas.microsoft.com/office/word/2010/wordprocessingShape" mc:Ignorable="w14 w15 w16se w16cid w16 w16cex w16sdtdh w16sdtfl w16du wp14">
+<w:hdr xmlns:wpc="http://schemas.microsoft.com/office/word/2010/wordprocessingCanvas" xmlns:cx="http://schemas.microsoft.com/office/drawing/2014/chartex" xmlns:cx1="http://schemas.microsoft.com/office/drawing/2015/9/8/chartex" xmlns:cx2="http://schemas.microsoft.com/office/drawing/2015/10/21/chartex" xmlns:cx3="http://schemas.microsoft.com/office/drawing/2016/5/9/chartex" xmlns:cx4="http://schemas.microsoft.com/office/drawing/2016/5/10/chartex" xmlns:cx5="http://schemas.microsoft.com/office/drawing/2016/5/11/chartex" xmlns:cx6="http://schemas.microsoft.com/office/drawing/2016/5/12/chartex" xmlns:cx7="http://schemas.microsoft.com/office/drawing/2016/5/13/chartex" xmlns:cx8="http://schemas.microsoft.com/office/drawing/2016/5/14/chartex" xmlns:mc="http://schemas.openxmlformats.org/markup-compatibility/2006" xmlns:aink="http://schemas.microsoft.com/office/drawing/2016/ink" xmlns:am3d="http://schemas.microsoft.com/office/drawing/2017/model3d" xmlns:o="urn:schemas-microsoft-com:office:office" xmlns:r="http://schemas.openxmlformats.org/officeDocument/2006/relationships" xmlns:m="http://schemas.openxmlformats.org/officeDocument/2006/math" xmlns:v="urn:schemas-microsoft-com:vml" xmlns:wp14="http://schemas.microsoft.com/office/word/2010/wordprocessingDrawing" xmlns:wp="http://schemas.openxmlformats.org/drawingml/2006/wordprocessingDrawing" xmlns:w10="urn:schemas-microsoft-com:office:word" xmlns:w="http://schemas.openxmlformats.org/wordprocessingml/2006/main" xmlns:w14="http://schemas.microsoft.com/office/word/2010/wordml" xmlns:w15="http://schemas.microsoft.com/office/word/2012/wordml" xmlns:w16cid="http://schemas.microsoft.com/office/word/2016/wordml/cid" xmlns:w16se="http://schemas.microsoft.com/office/word/2015/wordml/symex" xmlns:wpg="http://schemas.microsoft.com/office/word/2010/wordprocessingGroup" xmlns:wpi="http://schemas.microsoft.com/office/word/2010/wordprocessingInk" xmlns:wne="http://schemas.microsoft.com/office/word/2006/wordml" xmlns:wps="http://schemas.microsoft.com/office/word/2010/wordprocessingShape" mc:Ignorable="w14 w15 w16se w16cid wp14">
   <w:p>
     <w:pPr>
       <w:pStyle w:val="Encabezado"/>
@@ -3731,7 +3789,7 @@
 </file>
 
 <file path=word/header2.xml><?xml version="1.0" encoding="utf-8"?>
-<w:hdr xmlns:wpc="http://schemas.microsoft.com/office/word/2010/wordprocessingCanvas" xmlns:cx="http://schemas.microsoft.com/office/drawing/2014/chartex" xmlns:cx1="http://schemas.microsoft.com/office/drawing/2015/9/8/chartex" xmlns:cx2="http://schemas.microsoft.com/office/drawing/2015/10/21/chartex" xmlns:cx3="http://schemas.microsoft.com/office/drawing/2016/5/9/chartex" xmlns:cx4="http://schemas.microsoft.com/office/drawing/2016/5/10/chartex" xmlns:cx5="http://schemas.microsoft.com/office/drawing/2016/5/11/chartex" xmlns:cx6="http://schemas.microsoft.com/office/drawing/2016/5/12/chartex" xmlns:cx7="http://schemas.microsoft.com/office/drawing/2016/5/13/chartex" xmlns:cx8="http://schemas.microsoft.com/office/drawing/2016/5/14/chartex" xmlns:mc="http://schemas.openxmlformats.org/markup-compatibility/2006" xmlns:aink="http://schemas.microsoft.com/office/drawing/2016/ink" xmlns:am3d="http://schemas.microsoft.com/office/drawing/2017/model3d" xmlns:o="urn:schemas-microsoft-com:office:office" xmlns:oel="http://schemas.microsoft.com/office/2019/extlst" xmlns:r="http://schemas.openxmlformats.org/officeDocument/2006/relationships" xmlns:m="http://schemas.openxmlformats.org/officeDocument/2006/math" xmlns:v="urn:schemas-microsoft-com:vml" xmlns:wp14="http://schemas.microsoft.com/office/word/2010/wordprocessingDrawing" xmlns:wp="http://schemas.openxmlformats.org/drawingml/2006/wordprocessingDrawing" xmlns:w10="urn:schemas-microsoft-com:office:word" xmlns:w="http://schemas.openxmlformats.org/wordprocessingml/2006/main" xmlns:w14="http://schemas.microsoft.com/office/word/2010/wordml" xmlns:w15="http://schemas.microsoft.com/office/word/2012/wordml" xmlns:w16cex="http://schemas.microsoft.com/office/word/2018/wordml/cex" xmlns:w16cid="http://schemas.microsoft.com/office/word/2016/wordml/cid" xmlns:w16="http://schemas.microsoft.com/office/word/2018/wordml" xmlns:w16du="http://schemas.microsoft.com/office/word/2023/wordml/word16du" xmlns:w16sdtdh="http://schemas.microsoft.com/office/word/2020/wordml/sdtdatahash" xmlns:w16sdtfl="http://schemas.microsoft.com/office/word/2024/wordml/sdtformatlock" xmlns:w16se="http://schemas.microsoft.com/office/word/2015/wordml/symex" xmlns:wpg="http://schemas.microsoft.com/office/word/2010/wordprocessingGroup" xmlns:wpi="http://schemas.microsoft.com/office/word/2010/wordprocessingInk" xmlns:wne="http://schemas.microsoft.com/office/word/2006/wordml" xmlns:wps="http://schemas.microsoft.com/office/word/2010/wordprocessingShape" mc:Ignorable="w14 w15 w16se w16cid w16 w16cex w16sdtdh w16sdtfl w16du wp14">
+<w:hdr xmlns:wpc="http://schemas.microsoft.com/office/word/2010/wordprocessingCanvas" xmlns:cx="http://schemas.microsoft.com/office/drawing/2014/chartex" xmlns:cx1="http://schemas.microsoft.com/office/drawing/2015/9/8/chartex" xmlns:cx2="http://schemas.microsoft.com/office/drawing/2015/10/21/chartex" xmlns:cx3="http://schemas.microsoft.com/office/drawing/2016/5/9/chartex" xmlns:cx4="http://schemas.microsoft.com/office/drawing/2016/5/10/chartex" xmlns:cx5="http://schemas.microsoft.com/office/drawing/2016/5/11/chartex" xmlns:cx6="http://schemas.microsoft.com/office/drawing/2016/5/12/chartex" xmlns:cx7="http://schemas.microsoft.com/office/drawing/2016/5/13/chartex" xmlns:cx8="http://schemas.microsoft.com/office/drawing/2016/5/14/chartex" xmlns:mc="http://schemas.openxmlformats.org/markup-compatibility/2006" xmlns:aink="http://schemas.microsoft.com/office/drawing/2016/ink" xmlns:am3d="http://schemas.microsoft.com/office/drawing/2017/model3d" xmlns:o="urn:schemas-microsoft-com:office:office" xmlns:r="http://schemas.openxmlformats.org/officeDocument/2006/relationships" xmlns:m="http://schemas.openxmlformats.org/officeDocument/2006/math" xmlns:v="urn:schemas-microsoft-com:vml" xmlns:wp14="http://schemas.microsoft.com/office/word/2010/wordprocessingDrawing" xmlns:wp="http://schemas.openxmlformats.org/drawingml/2006/wordprocessingDrawing" xmlns:w10="urn:schemas-microsoft-com:office:word" xmlns:w="http://schemas.openxmlformats.org/wordprocessingml/2006/main" xmlns:w14="http://schemas.microsoft.com/office/word/2010/wordml" xmlns:w15="http://schemas.microsoft.com/office/word/2012/wordml" xmlns:w16cid="http://schemas.microsoft.com/office/word/2016/wordml/cid" xmlns:w16se="http://schemas.microsoft.com/office/word/2015/wordml/symex" xmlns:wpg="http://schemas.microsoft.com/office/word/2010/wordprocessingGroup" xmlns:wpi="http://schemas.microsoft.com/office/word/2010/wordprocessingInk" xmlns:wne="http://schemas.microsoft.com/office/word/2006/wordml" xmlns:wps="http://schemas.microsoft.com/office/word/2010/wordprocessingShape" mc:Ignorable="w14 w15 w16se w16cid wp14">
   <w:p>
     <w:pPr>
       <w:pStyle w:val="Encabezado"/>
@@ -3801,7 +3859,7 @@
 </file>
 
 <file path=word/numbering.xml><?xml version="1.0" encoding="utf-8"?>
-<w:numbering xmlns:wpc="http://schemas.microsoft.com/office/word/2010/wordprocessingCanvas" xmlns:cx="http://schemas.microsoft.com/office/drawing/2014/chartex" xmlns:cx1="http://schemas.microsoft.com/office/drawing/2015/9/8/chartex" xmlns:cx2="http://schemas.microsoft.com/office/drawing/2015/10/21/chartex" xmlns:cx3="http://schemas.microsoft.com/office/drawing/2016/5/9/chartex" xmlns:cx4="http://schemas.microsoft.com/office/drawing/2016/5/10/chartex" xmlns:cx5="http://schemas.microsoft.com/office/drawing/2016/5/11/chartex" xmlns:cx6="http://schemas.microsoft.com/office/drawing/2016/5/12/chartex" xmlns:cx7="http://schemas.microsoft.com/office/drawing/2016/5/13/chartex" xmlns:cx8="http://schemas.microsoft.com/office/drawing/2016/5/14/chartex" xmlns:mc="http://schemas.openxmlformats.org/markup-compatibility/2006" xmlns:aink="http://schemas.microsoft.com/office/drawing/2016/ink" xmlns:am3d="http://schemas.microsoft.com/office/drawing/2017/model3d" xmlns:o="urn:schemas-microsoft-com:office:office" xmlns:oel="http://schemas.microsoft.com/office/2019/extlst" xmlns:r="http://schemas.openxmlformats.org/officeDocument/2006/relationships" xmlns:m="http://schemas.openxmlformats.org/officeDocument/2006/math" xmlns:v="urn:schemas-microsoft-com:vml" xmlns:wp14="http://schemas.microsoft.com/office/word/2010/wordprocessingDrawing" xmlns:wp="http://schemas.openxmlformats.org/drawingml/2006/wordprocessingDrawing" xmlns:w10="urn:schemas-microsoft-com:office:word" xmlns:w="http://schemas.openxmlformats.org/wordprocessingml/2006/main" xmlns:w14="http://schemas.microsoft.com/office/word/2010/wordml" xmlns:w15="http://schemas.microsoft.com/office/word/2012/wordml" xmlns:w16cex="http://schemas.microsoft.com/office/word/2018/wordml/cex" xmlns:w16cid="http://schemas.microsoft.com/office/word/2016/wordml/cid" xmlns:w16="http://schemas.microsoft.com/office/word/2018/wordml" xmlns:w16du="http://schemas.microsoft.com/office/word/2023/wordml/word16du" xmlns:w16sdtdh="http://schemas.microsoft.com/office/word/2020/wordml/sdtdatahash" xmlns:w16sdtfl="http://schemas.microsoft.com/office/word/2024/wordml/sdtformatlock" xmlns:w16se="http://schemas.microsoft.com/office/word/2015/wordml/symex" xmlns:wpg="http://schemas.microsoft.com/office/word/2010/wordprocessingGroup" xmlns:wpi="http://schemas.microsoft.com/office/word/2010/wordprocessingInk" xmlns:wne="http://schemas.microsoft.com/office/word/2006/wordml" xmlns:wps="http://schemas.microsoft.com/office/word/2010/wordprocessingShape" mc:Ignorable="w14 w15 w16se w16cid w16 w16cex w16sdtdh w16sdtfl w16du wp14">
+<w:numbering xmlns:wpc="http://schemas.microsoft.com/office/word/2010/wordprocessingCanvas" xmlns:cx="http://schemas.microsoft.com/office/drawing/2014/chartex" xmlns:cx1="http://schemas.microsoft.com/office/drawing/2015/9/8/chartex" xmlns:cx2="http://schemas.microsoft.com/office/drawing/2015/10/21/chartex" xmlns:cx3="http://schemas.microsoft.com/office/drawing/2016/5/9/chartex" xmlns:cx4="http://schemas.microsoft.com/office/drawing/2016/5/10/chartex" xmlns:cx5="http://schemas.microsoft.com/office/drawing/2016/5/11/chartex" xmlns:cx6="http://schemas.microsoft.com/office/drawing/2016/5/12/chartex" xmlns:cx7="http://schemas.microsoft.com/office/drawing/2016/5/13/chartex" xmlns:cx8="http://schemas.microsoft.com/office/drawing/2016/5/14/chartex" xmlns:mc="http://schemas.openxmlformats.org/markup-compatibility/2006" xmlns:aink="http://schemas.microsoft.com/office/drawing/2016/ink" xmlns:am3d="http://schemas.microsoft.com/office/drawing/2017/model3d" xmlns:o="urn:schemas-microsoft-com:office:office" xmlns:r="http://schemas.openxmlformats.org/officeDocument/2006/relationships" xmlns:m="http://schemas.openxmlformats.org/officeDocument/2006/math" xmlns:v="urn:schemas-microsoft-com:vml" xmlns:wp14="http://schemas.microsoft.com/office/word/2010/wordprocessingDrawing" xmlns:wp="http://schemas.openxmlformats.org/drawingml/2006/wordprocessingDrawing" xmlns:w10="urn:schemas-microsoft-com:office:word" xmlns:w="http://schemas.openxmlformats.org/wordprocessingml/2006/main" xmlns:w14="http://schemas.microsoft.com/office/word/2010/wordml" xmlns:w15="http://schemas.microsoft.com/office/word/2012/wordml" xmlns:w16cid="http://schemas.microsoft.com/office/word/2016/wordml/cid" xmlns:w16se="http://schemas.microsoft.com/office/word/2015/wordml/symex" xmlns:wpg="http://schemas.microsoft.com/office/word/2010/wordprocessingGroup" xmlns:wpi="http://schemas.microsoft.com/office/word/2010/wordprocessingInk" xmlns:wne="http://schemas.microsoft.com/office/word/2006/wordml" xmlns:wps="http://schemas.microsoft.com/office/word/2010/wordprocessingShape" mc:Ignorable="w14 w15 w16se w16cid wp14">
   <w:abstractNum w:abstractNumId="0" w15:restartNumberingAfterBreak="0">
     <w:nsid w:val="0C0130EF"/>
     <w:multiLevelType w:val="hybridMultilevel"/>
@@ -4183,23 +4241,23 @@
       </w:rPr>
     </w:lvl>
   </w:abstractNum>
-  <w:num w:numId="1" w16cid:durableId="1424061733">
+  <w:num w:numId="1">
     <w:abstractNumId w:val="2"/>
   </w:num>
-  <w:num w:numId="2" w16cid:durableId="1874810086">
+  <w:num w:numId="2">
     <w:abstractNumId w:val="3"/>
   </w:num>
-  <w:num w:numId="3" w16cid:durableId="860977332">
+  <w:num w:numId="3">
     <w:abstractNumId w:val="1"/>
   </w:num>
-  <w:num w:numId="4" w16cid:durableId="26295759">
+  <w:num w:numId="4">
     <w:abstractNumId w:val="0"/>
   </w:num>
 </w:numbering>
 </file>
 
 <file path=word/styles.xml><?xml version="1.0" encoding="utf-8"?>
-<w:styles xmlns:mc="http://schemas.openxmlformats.org/markup-compatibility/2006" xmlns:r="http://schemas.openxmlformats.org/officeDocument/2006/relationships" xmlns:w="http://schemas.openxmlformats.org/wordprocessingml/2006/main" xmlns:w14="http://schemas.microsoft.com/office/word/2010/wordml" xmlns:w15="http://schemas.microsoft.com/office/word/2012/wordml" xmlns:w16cex="http://schemas.microsoft.com/office/word/2018/wordml/cex" xmlns:w16cid="http://schemas.microsoft.com/office/word/2016/wordml/cid" xmlns:w16="http://schemas.microsoft.com/office/word/2018/wordml" xmlns:w16du="http://schemas.microsoft.com/office/word/2023/wordml/word16du" xmlns:w16sdtdh="http://schemas.microsoft.com/office/word/2020/wordml/sdtdatahash" xmlns:w16sdtfl="http://schemas.microsoft.com/office/word/2024/wordml/sdtformatlock" xmlns:w16se="http://schemas.microsoft.com/office/word/2015/wordml/symex" mc:Ignorable="w14 w15 w16se w16cid w16 w16cex w16sdtdh w16sdtfl w16du">
+<w:styles xmlns:mc="http://schemas.openxmlformats.org/markup-compatibility/2006" xmlns:r="http://schemas.openxmlformats.org/officeDocument/2006/relationships" xmlns:w="http://schemas.openxmlformats.org/wordprocessingml/2006/main" xmlns:w14="http://schemas.microsoft.com/office/word/2010/wordml" xmlns:w15="http://schemas.microsoft.com/office/word/2012/wordml" xmlns:w16cid="http://schemas.microsoft.com/office/word/2016/wordml/cid" xmlns:w16se="http://schemas.microsoft.com/office/word/2015/wordml/symex" mc:Ignorable="w14 w15 w16se w16cid">
   <w:docDefaults>
     <w:rPrDefault>
       <w:rPr>
@@ -4217,7 +4275,7 @@
       </w:pPr>
     </w:pPrDefault>
   </w:docDefaults>
-  <w:latentStyles w:defLockedState="0" w:defUIPriority="99" w:defSemiHidden="0" w:defUnhideWhenUsed="0" w:defQFormat="0" w:count="376">
+  <w:latentStyles w:defLockedState="0" w:defUIPriority="99" w:defSemiHidden="0" w:defUnhideWhenUsed="0" w:defQFormat="0" w:count="375">
     <w:lsdException w:name="Normal" w:uiPriority="0" w:qFormat="1"/>
     <w:lsdException w:name="heading 1" w:uiPriority="9" w:qFormat="1"/>
     <w:lsdException w:name="heading 2" w:semiHidden="1" w:uiPriority="9" w:unhideWhenUsed="1" w:qFormat="1"/>
@@ -4593,7 +4651,6 @@
     <w:lsdException w:name="Smart Hyperlink" w:semiHidden="1" w:unhideWhenUsed="1"/>
     <w:lsdException w:name="Hashtag" w:semiHidden="1" w:unhideWhenUsed="1"/>
     <w:lsdException w:name="Unresolved Mention" w:semiHidden="1" w:unhideWhenUsed="1"/>
-    <w:lsdException w:name="Smart Link" w:semiHidden="1" w:unhideWhenUsed="1"/>
   </w:latentStyles>
   <w:style w:type="paragraph" w:default="1" w:styleId="Normal">
     <w:name w:val="Normal"/>

</xml_diff>

<commit_message>
Version para computadora nueva
</commit_message>
<xml_diff>
--- a/doc/patrocinio.docx
+++ b/doc/patrocinio.docx
@@ -1,6 +1,6 @@
 
 <file path=word/document.xml><?xml version="1.0" encoding="utf-8"?>
-<w:document xmlns:wpc="http://schemas.microsoft.com/office/word/2010/wordprocessingCanvas" xmlns:cx="http://schemas.microsoft.com/office/drawing/2014/chartex" xmlns:cx1="http://schemas.microsoft.com/office/drawing/2015/9/8/chartex" xmlns:cx2="http://schemas.microsoft.com/office/drawing/2015/10/21/chartex" xmlns:cx3="http://schemas.microsoft.com/office/drawing/2016/5/9/chartex" xmlns:cx4="http://schemas.microsoft.com/office/drawing/2016/5/10/chartex" xmlns:cx5="http://schemas.microsoft.com/office/drawing/2016/5/11/chartex" xmlns:cx6="http://schemas.microsoft.com/office/drawing/2016/5/12/chartex" xmlns:cx7="http://schemas.microsoft.com/office/drawing/2016/5/13/chartex" xmlns:cx8="http://schemas.microsoft.com/office/drawing/2016/5/14/chartex" xmlns:mc="http://schemas.openxmlformats.org/markup-compatibility/2006" xmlns:aink="http://schemas.microsoft.com/office/drawing/2016/ink" xmlns:am3d="http://schemas.microsoft.com/office/drawing/2017/model3d" xmlns:o="urn:schemas-microsoft-com:office:office" xmlns:r="http://schemas.openxmlformats.org/officeDocument/2006/relationships" xmlns:m="http://schemas.openxmlformats.org/officeDocument/2006/math" xmlns:v="urn:schemas-microsoft-com:vml" xmlns:wp14="http://schemas.microsoft.com/office/word/2010/wordprocessingDrawing" xmlns:wp="http://schemas.openxmlformats.org/drawingml/2006/wordprocessingDrawing" xmlns:w10="urn:schemas-microsoft-com:office:word" xmlns:w="http://schemas.openxmlformats.org/wordprocessingml/2006/main" xmlns:w14="http://schemas.microsoft.com/office/word/2010/wordml" xmlns:w15="http://schemas.microsoft.com/office/word/2012/wordml" xmlns:w16cid="http://schemas.microsoft.com/office/word/2016/wordml/cid" xmlns:w16se="http://schemas.microsoft.com/office/word/2015/wordml/symex" xmlns:wpg="http://schemas.microsoft.com/office/word/2010/wordprocessingGroup" xmlns:wpi="http://schemas.microsoft.com/office/word/2010/wordprocessingInk" xmlns:wne="http://schemas.microsoft.com/office/word/2006/wordml" xmlns:wps="http://schemas.microsoft.com/office/word/2010/wordprocessingShape" mc:Ignorable="w14 w15 w16se w16cid wp14">
+<w:document xmlns:wpc="http://schemas.microsoft.com/office/word/2010/wordprocessingCanvas" xmlns:cx="http://schemas.microsoft.com/office/drawing/2014/chartex" xmlns:cx1="http://schemas.microsoft.com/office/drawing/2015/9/8/chartex" xmlns:cx2="http://schemas.microsoft.com/office/drawing/2015/10/21/chartex" xmlns:cx3="http://schemas.microsoft.com/office/drawing/2016/5/9/chartex" xmlns:cx4="http://schemas.microsoft.com/office/drawing/2016/5/10/chartex" xmlns:cx5="http://schemas.microsoft.com/office/drawing/2016/5/11/chartex" xmlns:cx6="http://schemas.microsoft.com/office/drawing/2016/5/12/chartex" xmlns:cx7="http://schemas.microsoft.com/office/drawing/2016/5/13/chartex" xmlns:cx8="http://schemas.microsoft.com/office/drawing/2016/5/14/chartex" xmlns:mc="http://schemas.openxmlformats.org/markup-compatibility/2006" xmlns:aink="http://schemas.microsoft.com/office/drawing/2016/ink" xmlns:am3d="http://schemas.microsoft.com/office/drawing/2017/model3d" xmlns:o="urn:schemas-microsoft-com:office:office" xmlns:oel="http://schemas.microsoft.com/office/2019/extlst" xmlns:r="http://schemas.openxmlformats.org/officeDocument/2006/relationships" xmlns:m="http://schemas.openxmlformats.org/officeDocument/2006/math" xmlns:v="urn:schemas-microsoft-com:vml" xmlns:wp14="http://schemas.microsoft.com/office/word/2010/wordprocessingDrawing" xmlns:wp="http://schemas.openxmlformats.org/drawingml/2006/wordprocessingDrawing" xmlns:w10="urn:schemas-microsoft-com:office:word" xmlns:w="http://schemas.openxmlformats.org/wordprocessingml/2006/main" xmlns:w14="http://schemas.microsoft.com/office/word/2010/wordml" xmlns:w15="http://schemas.microsoft.com/office/word/2012/wordml" xmlns:w16cex="http://schemas.microsoft.com/office/word/2018/wordml/cex" xmlns:w16cid="http://schemas.microsoft.com/office/word/2016/wordml/cid" xmlns:w16="http://schemas.microsoft.com/office/word/2018/wordml" xmlns:w16du="http://schemas.microsoft.com/office/word/2023/wordml/word16du" xmlns:w16sdtdh="http://schemas.microsoft.com/office/word/2020/wordml/sdtdatahash" xmlns:w16sdtfl="http://schemas.microsoft.com/office/word/2024/wordml/sdtformatlock" xmlns:w16se="http://schemas.microsoft.com/office/word/2015/wordml/symex" xmlns:wpg="http://schemas.microsoft.com/office/word/2010/wordprocessingGroup" xmlns:wpi="http://schemas.microsoft.com/office/word/2010/wordprocessingInk" xmlns:wne="http://schemas.microsoft.com/office/word/2006/wordml" xmlns:wps="http://schemas.microsoft.com/office/word/2010/wordprocessingShape" mc:Ignorable="w14 w15 w16se w16cid w16 w16cex w16sdtdh w16sdtfl w16du wp14">
   <w:body>
     <w:p/>
     <w:p/>
@@ -18,15 +18,15 @@
         <mc:AlternateContent>
           <mc:Choice Requires="wps">
             <w:drawing>
-              <wp:anchor distT="0" distB="0" distL="114300" distR="114300" simplePos="0" relativeHeight="251659264" behindDoc="0" locked="1" layoutInCell="1" allowOverlap="0" wp14:anchorId="5B3F9792" wp14:editId="2AD79951">
+              <wp:anchor distT="0" distB="0" distL="114300" distR="114300" simplePos="0" relativeHeight="251659264" behindDoc="0" locked="1" layoutInCell="1" allowOverlap="0" wp14:anchorId="5B3F9792" wp14:editId="5C1728CA">
                 <wp:simplePos x="0" y="0"/>
                 <wp:positionH relativeFrom="page">
-                  <wp:align>center</wp:align>
+                  <wp:align>left</wp:align>
                 </wp:positionH>
                 <wp:positionV relativeFrom="margin">
                   <wp:posOffset>-360045</wp:posOffset>
                 </wp:positionV>
-                <wp:extent cx="7560000" cy="1620000"/>
+                <wp:extent cx="7559675" cy="1828800"/>
                 <wp:effectExtent l="0" t="0" r="3175" b="0"/>
                 <wp:wrapNone/>
                 <wp:docPr id="491564969" name="ctc1"/>
@@ -38,7 +38,7 @@
                       <wps:spPr>
                         <a:xfrm>
                           <a:off x="0" y="0"/>
-                          <a:ext cx="7560000" cy="1620000"/>
+                          <a:ext cx="7559675" cy="1828800"/>
                         </a:xfrm>
                         <a:prstGeom prst="rect">
                           <a:avLst/>
@@ -80,9 +80,9 @@
                               <w:tblLook w:val="0000" w:firstRow="0" w:lastRow="0" w:firstColumn="0" w:lastColumn="0" w:noHBand="0" w:noVBand="0"/>
                             </w:tblPr>
                             <w:tblGrid>
-                              <w:gridCol w:w="2965"/>
-                              <w:gridCol w:w="5885"/>
-                              <w:gridCol w:w="2196"/>
+                              <w:gridCol w:w="2969"/>
+                              <w:gridCol w:w="5893"/>
+                              <w:gridCol w:w="2199"/>
                             </w:tblGrid>
                             <w:tr>
                               <w:trPr>
@@ -260,7 +260,7 @@
                             <w:tr>
                               <w:trPr>
                                 <w:cantSplit/>
-                                <w:trHeight w:val="1200"/>
+                                <w:trHeight w:val="1951"/>
                                 <w:jc w:val="center"/>
                               </w:trPr>
                               <w:tc>
@@ -499,7 +499,7 @@
                 <v:stroke joinstyle="miter"/>
                 <v:path gradientshapeok="t" o:connecttype="rect"/>
               </v:shapetype>
-              <v:shape id="ctc1" o:spid="_x0000_s1026" type="#_x0000_t202" style="position:absolute;margin-left:0;margin-top:-28.35pt;width:595.3pt;height:127.55pt;z-index:251659264;visibility:visible;mso-wrap-style:square;mso-width-percent:0;mso-height-percent:0;mso-wrap-distance-left:9pt;mso-wrap-distance-top:0;mso-wrap-distance-right:9pt;mso-wrap-distance-bottom:0;mso-position-horizontal:center;mso-position-horizontal-relative:page;mso-position-vertical:absolute;mso-position-vertical-relative:margin;mso-width-percent:0;mso-height-percent:0;mso-width-relative:margin;mso-height-relative:margin;v-text-anchor:top" o:gfxdata="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" o:allowoverlap="f" fillcolor="white [3201]" stroked="f" strokeweight=".5pt">
+              <v:shape id="ctc1" o:spid="_x0000_s1026" type="#_x0000_t202" style="position:absolute;margin-left:0;margin-top:-28.35pt;width:595.25pt;height:2in;z-index:251659264;visibility:visible;mso-wrap-style:square;mso-width-percent:0;mso-height-percent:0;mso-wrap-distance-left:9pt;mso-wrap-distance-top:0;mso-wrap-distance-right:9pt;mso-wrap-distance-bottom:0;mso-position-horizontal:left;mso-position-horizontal-relative:page;mso-position-vertical:absolute;mso-position-vertical-relative:margin;mso-width-percent:0;mso-height-percent:0;mso-width-relative:margin;mso-height-relative:margin;v-text-anchor:top" o:gfxdata="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" o:allowoverlap="f" fillcolor="white [3201]" stroked="f" strokeweight=".5pt">
                 <v:textbox>
                   <w:txbxContent>
                     <w:tbl>
@@ -521,9 +521,9 @@
                         <w:tblLook w:val="0000" w:firstRow="0" w:lastRow="0" w:firstColumn="0" w:lastColumn="0" w:noHBand="0" w:noVBand="0"/>
                       </w:tblPr>
                       <w:tblGrid>
-                        <w:gridCol w:w="2965"/>
-                        <w:gridCol w:w="5885"/>
-                        <w:gridCol w:w="2196"/>
+                        <w:gridCol w:w="2969"/>
+                        <w:gridCol w:w="5893"/>
+                        <w:gridCol w:w="2199"/>
                       </w:tblGrid>
                       <w:tr>
                         <w:trPr>
@@ -701,7 +701,7 @@
                       <w:tr>
                         <w:trPr>
                           <w:cantSplit/>
-                          <w:trHeight w:val="1200"/>
+                          <w:trHeight w:val="1951"/>
                           <w:jc w:val="center"/>
                         </w:trPr>
                         <w:tc>
@@ -1169,7 +1169,6 @@
                                     </w:rPr>
                                   </w:pPr>
                                   <w:bookmarkStart w:id="0" w:name="_Hlk168652179"/>
-                                  <w:bookmarkStart w:id="1" w:name="_GoBack" w:colFirst="0" w:colLast="2"/>
                                   <w:r>
                                     <w:rPr>
                                       <w:rFonts w:ascii="Arial" w:hAnsi="Arial" w:cs="Arial"/>
@@ -1290,7 +1289,6 @@
                                 </w:p>
                               </w:tc>
                             </w:tr>
-                            <w:bookmarkEnd w:id="1"/>
                             <w:tr>
                               <w:trPr>
                                 <w:trHeight w:val="266"/>
@@ -1679,7 +1677,7 @@
           </mc:Choice>
           <mc:Fallback>
             <w:pict>
-              <v:shape w14:anchorId="6DD83CFD" id="_x0000_s1027" type="#_x0000_t202" style="position:absolute;margin-left:14pt;margin-top:595.35pt;width:566.9pt;height:127pt;z-index:251661312;visibility:visible;mso-wrap-style:square;mso-width-percent:0;mso-height-percent:0;mso-wrap-distance-left:9pt;mso-wrap-distance-top:0;mso-wrap-distance-right:9pt;mso-wrap-distance-bottom:0;mso-position-horizontal:absolute;mso-position-horizontal-relative:page;mso-position-vertical:absolute;mso-position-vertical-relative:margin;mso-width-percent:0;mso-height-percent:0;mso-width-relative:margin;mso-height-relative:margin;v-text-anchor:top" o:gfxdata="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" o:allowoverlap="f" fillcolor="white [3201]" stroked="f" strokeweight=".5pt">
+              <v:shape w14:anchorId="6DD83CFD" id="_x0000_s1027" type="#_x0000_t202" style="position:absolute;margin-left:14pt;margin-top:595.35pt;width:566.9pt;height:127pt;z-index:251661312;visibility:visible;mso-wrap-style:square;mso-width-percent:0;mso-height-percent:0;mso-wrap-distance-left:9pt;mso-wrap-distance-top:0;mso-wrap-distance-right:9pt;mso-wrap-distance-bottom:0;mso-position-horizontal:absolute;mso-position-horizontal-relative:page;mso-position-vertical:absolute;mso-position-vertical-relative:margin;mso-width-percent:0;mso-height-percent:0;mso-width-relative:margin;mso-height-relative:margin;v-text-anchor:top" o:gfxdata="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" o:allowoverlap="f" fillcolor="white [3201]" stroked="f" strokeweight=".5pt">
                 <v:textbox>
                   <w:txbxContent>
                     <w:tbl>
@@ -1723,8 +1721,7 @@
                                 <w:szCs w:val="18"/>
                               </w:rPr>
                             </w:pPr>
-                            <w:bookmarkStart w:id="2" w:name="_Hlk168652179"/>
-                            <w:bookmarkStart w:id="3" w:name="_GoBack" w:colFirst="0" w:colLast="2"/>
+                            <w:bookmarkStart w:id="1" w:name="_Hlk168652179"/>
                             <w:r>
                               <w:rPr>
                                 <w:rFonts w:ascii="Arial" w:hAnsi="Arial" w:cs="Arial"/>
@@ -1845,7 +1842,6 @@
                           </w:p>
                         </w:tc>
                       </w:tr>
-                      <w:bookmarkEnd w:id="3"/>
                       <w:tr>
                         <w:trPr>
                           <w:trHeight w:val="266"/>
@@ -2209,7 +2205,7 @@
                           </w:p>
                         </w:tc>
                       </w:tr>
-                      <w:bookmarkEnd w:id="2"/>
+                      <w:bookmarkEnd w:id="1"/>
                     </w:tbl>
                     <w:p/>
                   </w:txbxContent>
@@ -3374,7 +3370,7 @@
 </file>
 
 <file path=word/endnotes.xml><?xml version="1.0" encoding="utf-8"?>
-<w:endnotes xmlns:wpc="http://schemas.microsoft.com/office/word/2010/wordprocessingCanvas" xmlns:cx="http://schemas.microsoft.com/office/drawing/2014/chartex" xmlns:cx1="http://schemas.microsoft.com/office/drawing/2015/9/8/chartex" xmlns:cx2="http://schemas.microsoft.com/office/drawing/2015/10/21/chartex" xmlns:cx3="http://schemas.microsoft.com/office/drawing/2016/5/9/chartex" xmlns:cx4="http://schemas.microsoft.com/office/drawing/2016/5/10/chartex" xmlns:cx5="http://schemas.microsoft.com/office/drawing/2016/5/11/chartex" xmlns:cx6="http://schemas.microsoft.com/office/drawing/2016/5/12/chartex" xmlns:cx7="http://schemas.microsoft.com/office/drawing/2016/5/13/chartex" xmlns:cx8="http://schemas.microsoft.com/office/drawing/2016/5/14/chartex" xmlns:mc="http://schemas.openxmlformats.org/markup-compatibility/2006" xmlns:aink="http://schemas.microsoft.com/office/drawing/2016/ink" xmlns:am3d="http://schemas.microsoft.com/office/drawing/2017/model3d" xmlns:o="urn:schemas-microsoft-com:office:office" xmlns:r="http://schemas.openxmlformats.org/officeDocument/2006/relationships" xmlns:m="http://schemas.openxmlformats.org/officeDocument/2006/math" xmlns:v="urn:schemas-microsoft-com:vml" xmlns:wp14="http://schemas.microsoft.com/office/word/2010/wordprocessingDrawing" xmlns:wp="http://schemas.openxmlformats.org/drawingml/2006/wordprocessingDrawing" xmlns:w10="urn:schemas-microsoft-com:office:word" xmlns:w="http://schemas.openxmlformats.org/wordprocessingml/2006/main" xmlns:w14="http://schemas.microsoft.com/office/word/2010/wordml" xmlns:w15="http://schemas.microsoft.com/office/word/2012/wordml" xmlns:w16cid="http://schemas.microsoft.com/office/word/2016/wordml/cid" xmlns:w16se="http://schemas.microsoft.com/office/word/2015/wordml/symex" xmlns:wpg="http://schemas.microsoft.com/office/word/2010/wordprocessingGroup" xmlns:wpi="http://schemas.microsoft.com/office/word/2010/wordprocessingInk" xmlns:wne="http://schemas.microsoft.com/office/word/2006/wordml" xmlns:wps="http://schemas.microsoft.com/office/word/2010/wordprocessingShape" mc:Ignorable="w14 w15 w16se w16cid wp14">
+<w:endnotes xmlns:wpc="http://schemas.microsoft.com/office/word/2010/wordprocessingCanvas" xmlns:cx="http://schemas.microsoft.com/office/drawing/2014/chartex" xmlns:cx1="http://schemas.microsoft.com/office/drawing/2015/9/8/chartex" xmlns:cx2="http://schemas.microsoft.com/office/drawing/2015/10/21/chartex" xmlns:cx3="http://schemas.microsoft.com/office/drawing/2016/5/9/chartex" xmlns:cx4="http://schemas.microsoft.com/office/drawing/2016/5/10/chartex" xmlns:cx5="http://schemas.microsoft.com/office/drawing/2016/5/11/chartex" xmlns:cx6="http://schemas.microsoft.com/office/drawing/2016/5/12/chartex" xmlns:cx7="http://schemas.microsoft.com/office/drawing/2016/5/13/chartex" xmlns:cx8="http://schemas.microsoft.com/office/drawing/2016/5/14/chartex" xmlns:mc="http://schemas.openxmlformats.org/markup-compatibility/2006" xmlns:aink="http://schemas.microsoft.com/office/drawing/2016/ink" xmlns:am3d="http://schemas.microsoft.com/office/drawing/2017/model3d" xmlns:o="urn:schemas-microsoft-com:office:office" xmlns:oel="http://schemas.microsoft.com/office/2019/extlst" xmlns:r="http://schemas.openxmlformats.org/officeDocument/2006/relationships" xmlns:m="http://schemas.openxmlformats.org/officeDocument/2006/math" xmlns:v="urn:schemas-microsoft-com:vml" xmlns:wp14="http://schemas.microsoft.com/office/word/2010/wordprocessingDrawing" xmlns:wp="http://schemas.openxmlformats.org/drawingml/2006/wordprocessingDrawing" xmlns:w10="urn:schemas-microsoft-com:office:word" xmlns:w="http://schemas.openxmlformats.org/wordprocessingml/2006/main" xmlns:w14="http://schemas.microsoft.com/office/word/2010/wordml" xmlns:w15="http://schemas.microsoft.com/office/word/2012/wordml" xmlns:w16cex="http://schemas.microsoft.com/office/word/2018/wordml/cex" xmlns:w16cid="http://schemas.microsoft.com/office/word/2016/wordml/cid" xmlns:w16="http://schemas.microsoft.com/office/word/2018/wordml" xmlns:w16du="http://schemas.microsoft.com/office/word/2023/wordml/word16du" xmlns:w16sdtdh="http://schemas.microsoft.com/office/word/2020/wordml/sdtdatahash" xmlns:w16sdtfl="http://schemas.microsoft.com/office/word/2024/wordml/sdtformatlock" xmlns:w16se="http://schemas.microsoft.com/office/word/2015/wordml/symex" xmlns:wpg="http://schemas.microsoft.com/office/word/2010/wordprocessingGroup" xmlns:wpi="http://schemas.microsoft.com/office/word/2010/wordprocessingInk" xmlns:wne="http://schemas.microsoft.com/office/word/2006/wordml" xmlns:wps="http://schemas.microsoft.com/office/word/2010/wordprocessingShape" mc:Ignorable="w14 w15 w16se w16cid w16 w16cex w16sdtdh w16sdtfl w16du wp14">
   <w:endnote w:type="separator" w:id="-1">
     <w:p>
       <w:pPr>
@@ -3399,7 +3395,7 @@
 </file>
 
 <file path=word/footer1.xml><?xml version="1.0" encoding="utf-8"?>
-<w:ftr xmlns:wpc="http://schemas.microsoft.com/office/word/2010/wordprocessingCanvas" xmlns:cx="http://schemas.microsoft.com/office/drawing/2014/chartex" xmlns:cx1="http://schemas.microsoft.com/office/drawing/2015/9/8/chartex" xmlns:cx2="http://schemas.microsoft.com/office/drawing/2015/10/21/chartex" xmlns:cx3="http://schemas.microsoft.com/office/drawing/2016/5/9/chartex" xmlns:cx4="http://schemas.microsoft.com/office/drawing/2016/5/10/chartex" xmlns:cx5="http://schemas.microsoft.com/office/drawing/2016/5/11/chartex" xmlns:cx6="http://schemas.microsoft.com/office/drawing/2016/5/12/chartex" xmlns:cx7="http://schemas.microsoft.com/office/drawing/2016/5/13/chartex" xmlns:cx8="http://schemas.microsoft.com/office/drawing/2016/5/14/chartex" xmlns:mc="http://schemas.openxmlformats.org/markup-compatibility/2006" xmlns:aink="http://schemas.microsoft.com/office/drawing/2016/ink" xmlns:am3d="http://schemas.microsoft.com/office/drawing/2017/model3d" xmlns:o="urn:schemas-microsoft-com:office:office" xmlns:r="http://schemas.openxmlformats.org/officeDocument/2006/relationships" xmlns:m="http://schemas.openxmlformats.org/officeDocument/2006/math" xmlns:v="urn:schemas-microsoft-com:vml" xmlns:wp14="http://schemas.microsoft.com/office/word/2010/wordprocessingDrawing" xmlns:wp="http://schemas.openxmlformats.org/drawingml/2006/wordprocessingDrawing" xmlns:w10="urn:schemas-microsoft-com:office:word" xmlns:w="http://schemas.openxmlformats.org/wordprocessingml/2006/main" xmlns:w14="http://schemas.microsoft.com/office/word/2010/wordml" xmlns:w15="http://schemas.microsoft.com/office/word/2012/wordml" xmlns:w16cid="http://schemas.microsoft.com/office/word/2016/wordml/cid" xmlns:w16se="http://schemas.microsoft.com/office/word/2015/wordml/symex" xmlns:wpg="http://schemas.microsoft.com/office/word/2010/wordprocessingGroup" xmlns:wpi="http://schemas.microsoft.com/office/word/2010/wordprocessingInk" xmlns:wne="http://schemas.microsoft.com/office/word/2006/wordml" xmlns:wps="http://schemas.microsoft.com/office/word/2010/wordprocessingShape" mc:Ignorable="w14 w15 w16se w16cid wp14">
+<w:ftr xmlns:wpc="http://schemas.microsoft.com/office/word/2010/wordprocessingCanvas" xmlns:cx="http://schemas.microsoft.com/office/drawing/2014/chartex" xmlns:cx1="http://schemas.microsoft.com/office/drawing/2015/9/8/chartex" xmlns:cx2="http://schemas.microsoft.com/office/drawing/2015/10/21/chartex" xmlns:cx3="http://schemas.microsoft.com/office/drawing/2016/5/9/chartex" xmlns:cx4="http://schemas.microsoft.com/office/drawing/2016/5/10/chartex" xmlns:cx5="http://schemas.microsoft.com/office/drawing/2016/5/11/chartex" xmlns:cx6="http://schemas.microsoft.com/office/drawing/2016/5/12/chartex" xmlns:cx7="http://schemas.microsoft.com/office/drawing/2016/5/13/chartex" xmlns:cx8="http://schemas.microsoft.com/office/drawing/2016/5/14/chartex" xmlns:mc="http://schemas.openxmlformats.org/markup-compatibility/2006" xmlns:aink="http://schemas.microsoft.com/office/drawing/2016/ink" xmlns:am3d="http://schemas.microsoft.com/office/drawing/2017/model3d" xmlns:o="urn:schemas-microsoft-com:office:office" xmlns:oel="http://schemas.microsoft.com/office/2019/extlst" xmlns:r="http://schemas.openxmlformats.org/officeDocument/2006/relationships" xmlns:m="http://schemas.openxmlformats.org/officeDocument/2006/math" xmlns:v="urn:schemas-microsoft-com:vml" xmlns:wp14="http://schemas.microsoft.com/office/word/2010/wordprocessingDrawing" xmlns:wp="http://schemas.openxmlformats.org/drawingml/2006/wordprocessingDrawing" xmlns:w10="urn:schemas-microsoft-com:office:word" xmlns:w="http://schemas.openxmlformats.org/wordprocessingml/2006/main" xmlns:w14="http://schemas.microsoft.com/office/word/2010/wordml" xmlns:w15="http://schemas.microsoft.com/office/word/2012/wordml" xmlns:w16cex="http://schemas.microsoft.com/office/word/2018/wordml/cex" xmlns:w16cid="http://schemas.microsoft.com/office/word/2016/wordml/cid" xmlns:w16="http://schemas.microsoft.com/office/word/2018/wordml" xmlns:w16du="http://schemas.microsoft.com/office/word/2023/wordml/word16du" xmlns:w16sdtdh="http://schemas.microsoft.com/office/word/2020/wordml/sdtdatahash" xmlns:w16sdtfl="http://schemas.microsoft.com/office/word/2024/wordml/sdtformatlock" xmlns:w16se="http://schemas.microsoft.com/office/word/2015/wordml/symex" xmlns:wpg="http://schemas.microsoft.com/office/word/2010/wordprocessingGroup" xmlns:wpi="http://schemas.microsoft.com/office/word/2010/wordprocessingInk" xmlns:wne="http://schemas.microsoft.com/office/word/2006/wordml" xmlns:wps="http://schemas.microsoft.com/office/word/2010/wordprocessingShape" mc:Ignorable="w14 w15 w16se w16cid w16 w16cex w16sdtdh w16sdtfl w16du wp14">
   <w:p>
     <w:pPr>
       <w:pStyle w:val="Piedepgina"/>
@@ -3519,7 +3515,7 @@
 </file>
 
 <file path=word/footer2.xml><?xml version="1.0" encoding="utf-8"?>
-<w:ftr xmlns:wpc="http://schemas.microsoft.com/office/word/2010/wordprocessingCanvas" xmlns:cx="http://schemas.microsoft.com/office/drawing/2014/chartex" xmlns:cx1="http://schemas.microsoft.com/office/drawing/2015/9/8/chartex" xmlns:cx2="http://schemas.microsoft.com/office/drawing/2015/10/21/chartex" xmlns:cx3="http://schemas.microsoft.com/office/drawing/2016/5/9/chartex" xmlns:cx4="http://schemas.microsoft.com/office/drawing/2016/5/10/chartex" xmlns:cx5="http://schemas.microsoft.com/office/drawing/2016/5/11/chartex" xmlns:cx6="http://schemas.microsoft.com/office/drawing/2016/5/12/chartex" xmlns:cx7="http://schemas.microsoft.com/office/drawing/2016/5/13/chartex" xmlns:cx8="http://schemas.microsoft.com/office/drawing/2016/5/14/chartex" xmlns:mc="http://schemas.openxmlformats.org/markup-compatibility/2006" xmlns:aink="http://schemas.microsoft.com/office/drawing/2016/ink" xmlns:am3d="http://schemas.microsoft.com/office/drawing/2017/model3d" xmlns:o="urn:schemas-microsoft-com:office:office" xmlns:r="http://schemas.openxmlformats.org/officeDocument/2006/relationships" xmlns:m="http://schemas.openxmlformats.org/officeDocument/2006/math" xmlns:v="urn:schemas-microsoft-com:vml" xmlns:wp14="http://schemas.microsoft.com/office/word/2010/wordprocessingDrawing" xmlns:wp="http://schemas.openxmlformats.org/drawingml/2006/wordprocessingDrawing" xmlns:w10="urn:schemas-microsoft-com:office:word" xmlns:w="http://schemas.openxmlformats.org/wordprocessingml/2006/main" xmlns:w14="http://schemas.microsoft.com/office/word/2010/wordml" xmlns:w15="http://schemas.microsoft.com/office/word/2012/wordml" xmlns:w16cid="http://schemas.microsoft.com/office/word/2016/wordml/cid" xmlns:w16se="http://schemas.microsoft.com/office/word/2015/wordml/symex" xmlns:wpg="http://schemas.microsoft.com/office/word/2010/wordprocessingGroup" xmlns:wpi="http://schemas.microsoft.com/office/word/2010/wordprocessingInk" xmlns:wne="http://schemas.microsoft.com/office/word/2006/wordml" xmlns:wps="http://schemas.microsoft.com/office/word/2010/wordprocessingShape" mc:Ignorable="w14 w15 w16se w16cid wp14">
+<w:ftr xmlns:wpc="http://schemas.microsoft.com/office/word/2010/wordprocessingCanvas" xmlns:cx="http://schemas.microsoft.com/office/drawing/2014/chartex" xmlns:cx1="http://schemas.microsoft.com/office/drawing/2015/9/8/chartex" xmlns:cx2="http://schemas.microsoft.com/office/drawing/2015/10/21/chartex" xmlns:cx3="http://schemas.microsoft.com/office/drawing/2016/5/9/chartex" xmlns:cx4="http://schemas.microsoft.com/office/drawing/2016/5/10/chartex" xmlns:cx5="http://schemas.microsoft.com/office/drawing/2016/5/11/chartex" xmlns:cx6="http://schemas.microsoft.com/office/drawing/2016/5/12/chartex" xmlns:cx7="http://schemas.microsoft.com/office/drawing/2016/5/13/chartex" xmlns:cx8="http://schemas.microsoft.com/office/drawing/2016/5/14/chartex" xmlns:mc="http://schemas.openxmlformats.org/markup-compatibility/2006" xmlns:aink="http://schemas.microsoft.com/office/drawing/2016/ink" xmlns:am3d="http://schemas.microsoft.com/office/drawing/2017/model3d" xmlns:o="urn:schemas-microsoft-com:office:office" xmlns:oel="http://schemas.microsoft.com/office/2019/extlst" xmlns:r="http://schemas.openxmlformats.org/officeDocument/2006/relationships" xmlns:m="http://schemas.openxmlformats.org/officeDocument/2006/math" xmlns:v="urn:schemas-microsoft-com:vml" xmlns:wp14="http://schemas.microsoft.com/office/word/2010/wordprocessingDrawing" xmlns:wp="http://schemas.openxmlformats.org/drawingml/2006/wordprocessingDrawing" xmlns:w10="urn:schemas-microsoft-com:office:word" xmlns:w="http://schemas.openxmlformats.org/wordprocessingml/2006/main" xmlns:w14="http://schemas.microsoft.com/office/word/2010/wordml" xmlns:w15="http://schemas.microsoft.com/office/word/2012/wordml" xmlns:w16cex="http://schemas.microsoft.com/office/word/2018/wordml/cex" xmlns:w16cid="http://schemas.microsoft.com/office/word/2016/wordml/cid" xmlns:w16="http://schemas.microsoft.com/office/word/2018/wordml" xmlns:w16du="http://schemas.microsoft.com/office/word/2023/wordml/word16du" xmlns:w16sdtdh="http://schemas.microsoft.com/office/word/2020/wordml/sdtdatahash" xmlns:w16sdtfl="http://schemas.microsoft.com/office/word/2024/wordml/sdtformatlock" xmlns:w16se="http://schemas.microsoft.com/office/word/2015/wordml/symex" xmlns:wpg="http://schemas.microsoft.com/office/word/2010/wordprocessingGroup" xmlns:wpi="http://schemas.microsoft.com/office/word/2010/wordprocessingInk" xmlns:wne="http://schemas.microsoft.com/office/word/2006/wordml" xmlns:wps="http://schemas.microsoft.com/office/word/2010/wordprocessingShape" mc:Ignorable="w14 w15 w16se w16cid w16 w16cex w16sdtdh w16sdtfl w16du wp14">
   <w:p>
     <w:pPr>
       <w:pStyle w:val="Piedepgina"/>
@@ -3639,7 +3635,7 @@
 </file>
 
 <file path=word/footnotes.xml><?xml version="1.0" encoding="utf-8"?>
-<w:footnotes xmlns:wpc="http://schemas.microsoft.com/office/word/2010/wordprocessingCanvas" xmlns:cx="http://schemas.microsoft.com/office/drawing/2014/chartex" xmlns:cx1="http://schemas.microsoft.com/office/drawing/2015/9/8/chartex" xmlns:cx2="http://schemas.microsoft.com/office/drawing/2015/10/21/chartex" xmlns:cx3="http://schemas.microsoft.com/office/drawing/2016/5/9/chartex" xmlns:cx4="http://schemas.microsoft.com/office/drawing/2016/5/10/chartex" xmlns:cx5="http://schemas.microsoft.com/office/drawing/2016/5/11/chartex" xmlns:cx6="http://schemas.microsoft.com/office/drawing/2016/5/12/chartex" xmlns:cx7="http://schemas.microsoft.com/office/drawing/2016/5/13/chartex" xmlns:cx8="http://schemas.microsoft.com/office/drawing/2016/5/14/chartex" xmlns:mc="http://schemas.openxmlformats.org/markup-compatibility/2006" xmlns:aink="http://schemas.microsoft.com/office/drawing/2016/ink" xmlns:am3d="http://schemas.microsoft.com/office/drawing/2017/model3d" xmlns:o="urn:schemas-microsoft-com:office:office" xmlns:r="http://schemas.openxmlformats.org/officeDocument/2006/relationships" xmlns:m="http://schemas.openxmlformats.org/officeDocument/2006/math" xmlns:v="urn:schemas-microsoft-com:vml" xmlns:wp14="http://schemas.microsoft.com/office/word/2010/wordprocessingDrawing" xmlns:wp="http://schemas.openxmlformats.org/drawingml/2006/wordprocessingDrawing" xmlns:w10="urn:schemas-microsoft-com:office:word" xmlns:w="http://schemas.openxmlformats.org/wordprocessingml/2006/main" xmlns:w14="http://schemas.microsoft.com/office/word/2010/wordml" xmlns:w15="http://schemas.microsoft.com/office/word/2012/wordml" xmlns:w16cid="http://schemas.microsoft.com/office/word/2016/wordml/cid" xmlns:w16se="http://schemas.microsoft.com/office/word/2015/wordml/symex" xmlns:wpg="http://schemas.microsoft.com/office/word/2010/wordprocessingGroup" xmlns:wpi="http://schemas.microsoft.com/office/word/2010/wordprocessingInk" xmlns:wne="http://schemas.microsoft.com/office/word/2006/wordml" xmlns:wps="http://schemas.microsoft.com/office/word/2010/wordprocessingShape" mc:Ignorable="w14 w15 w16se w16cid wp14">
+<w:footnotes xmlns:wpc="http://schemas.microsoft.com/office/word/2010/wordprocessingCanvas" xmlns:cx="http://schemas.microsoft.com/office/drawing/2014/chartex" xmlns:cx1="http://schemas.microsoft.com/office/drawing/2015/9/8/chartex" xmlns:cx2="http://schemas.microsoft.com/office/drawing/2015/10/21/chartex" xmlns:cx3="http://schemas.microsoft.com/office/drawing/2016/5/9/chartex" xmlns:cx4="http://schemas.microsoft.com/office/drawing/2016/5/10/chartex" xmlns:cx5="http://schemas.microsoft.com/office/drawing/2016/5/11/chartex" xmlns:cx6="http://schemas.microsoft.com/office/drawing/2016/5/12/chartex" xmlns:cx7="http://schemas.microsoft.com/office/drawing/2016/5/13/chartex" xmlns:cx8="http://schemas.microsoft.com/office/drawing/2016/5/14/chartex" xmlns:mc="http://schemas.openxmlformats.org/markup-compatibility/2006" xmlns:aink="http://schemas.microsoft.com/office/drawing/2016/ink" xmlns:am3d="http://schemas.microsoft.com/office/drawing/2017/model3d" xmlns:o="urn:schemas-microsoft-com:office:office" xmlns:oel="http://schemas.microsoft.com/office/2019/extlst" xmlns:r="http://schemas.openxmlformats.org/officeDocument/2006/relationships" xmlns:m="http://schemas.openxmlformats.org/officeDocument/2006/math" xmlns:v="urn:schemas-microsoft-com:vml" xmlns:wp14="http://schemas.microsoft.com/office/word/2010/wordprocessingDrawing" xmlns:wp="http://schemas.openxmlformats.org/drawingml/2006/wordprocessingDrawing" xmlns:w10="urn:schemas-microsoft-com:office:word" xmlns:w="http://schemas.openxmlformats.org/wordprocessingml/2006/main" xmlns:w14="http://schemas.microsoft.com/office/word/2010/wordml" xmlns:w15="http://schemas.microsoft.com/office/word/2012/wordml" xmlns:w16cex="http://schemas.microsoft.com/office/word/2018/wordml/cex" xmlns:w16cid="http://schemas.microsoft.com/office/word/2016/wordml/cid" xmlns:w16="http://schemas.microsoft.com/office/word/2018/wordml" xmlns:w16du="http://schemas.microsoft.com/office/word/2023/wordml/word16du" xmlns:w16sdtdh="http://schemas.microsoft.com/office/word/2020/wordml/sdtdatahash" xmlns:w16sdtfl="http://schemas.microsoft.com/office/word/2024/wordml/sdtformatlock" xmlns:w16se="http://schemas.microsoft.com/office/word/2015/wordml/symex" xmlns:wpg="http://schemas.microsoft.com/office/word/2010/wordprocessingGroup" xmlns:wpi="http://schemas.microsoft.com/office/word/2010/wordprocessingInk" xmlns:wne="http://schemas.microsoft.com/office/word/2006/wordml" xmlns:wps="http://schemas.microsoft.com/office/word/2010/wordprocessingShape" mc:Ignorable="w14 w15 w16se w16cid w16 w16cex w16sdtdh w16sdtfl w16du wp14">
   <w:footnote w:type="separator" w:id="-1">
     <w:p>
       <w:pPr>
@@ -3664,7 +3660,7 @@
 </file>
 
 <file path=word/header1.xml><?xml version="1.0" encoding="utf-8"?>
-<w:hdr xmlns:wpc="http://schemas.microsoft.com/office/word/2010/wordprocessingCanvas" xmlns:cx="http://schemas.microsoft.com/office/drawing/2014/chartex" xmlns:cx1="http://schemas.microsoft.com/office/drawing/2015/9/8/chartex" xmlns:cx2="http://schemas.microsoft.com/office/drawing/2015/10/21/chartex" xmlns:cx3="http://schemas.microsoft.com/office/drawing/2016/5/9/chartex" xmlns:cx4="http://schemas.microsoft.com/office/drawing/2016/5/10/chartex" xmlns:cx5="http://schemas.microsoft.com/office/drawing/2016/5/11/chartex" xmlns:cx6="http://schemas.microsoft.com/office/drawing/2016/5/12/chartex" xmlns:cx7="http://schemas.microsoft.com/office/drawing/2016/5/13/chartex" xmlns:cx8="http://schemas.microsoft.com/office/drawing/2016/5/14/chartex" xmlns:mc="http://schemas.openxmlformats.org/markup-compatibility/2006" xmlns:aink="http://schemas.microsoft.com/office/drawing/2016/ink" xmlns:am3d="http://schemas.microsoft.com/office/drawing/2017/model3d" xmlns:o="urn:schemas-microsoft-com:office:office" xmlns:r="http://schemas.openxmlformats.org/officeDocument/2006/relationships" xmlns:m="http://schemas.openxmlformats.org/officeDocument/2006/math" xmlns:v="urn:schemas-microsoft-com:vml" xmlns:wp14="http://schemas.microsoft.com/office/word/2010/wordprocessingDrawing" xmlns:wp="http://schemas.openxmlformats.org/drawingml/2006/wordprocessingDrawing" xmlns:w10="urn:schemas-microsoft-com:office:word" xmlns:w="http://schemas.openxmlformats.org/wordprocessingml/2006/main" xmlns:w14="http://schemas.microsoft.com/office/word/2010/wordml" xmlns:w15="http://schemas.microsoft.com/office/word/2012/wordml" xmlns:w16cid="http://schemas.microsoft.com/office/word/2016/wordml/cid" xmlns:w16se="http://schemas.microsoft.com/office/word/2015/wordml/symex" xmlns:wpg="http://schemas.microsoft.com/office/word/2010/wordprocessingGroup" xmlns:wpi="http://schemas.microsoft.com/office/word/2010/wordprocessingInk" xmlns:wne="http://schemas.microsoft.com/office/word/2006/wordml" xmlns:wps="http://schemas.microsoft.com/office/word/2010/wordprocessingShape" mc:Ignorable="w14 w15 w16se w16cid wp14">
+<w:hdr xmlns:wpc="http://schemas.microsoft.com/office/word/2010/wordprocessingCanvas" xmlns:cx="http://schemas.microsoft.com/office/drawing/2014/chartex" xmlns:cx1="http://schemas.microsoft.com/office/drawing/2015/9/8/chartex" xmlns:cx2="http://schemas.microsoft.com/office/drawing/2015/10/21/chartex" xmlns:cx3="http://schemas.microsoft.com/office/drawing/2016/5/9/chartex" xmlns:cx4="http://schemas.microsoft.com/office/drawing/2016/5/10/chartex" xmlns:cx5="http://schemas.microsoft.com/office/drawing/2016/5/11/chartex" xmlns:cx6="http://schemas.microsoft.com/office/drawing/2016/5/12/chartex" xmlns:cx7="http://schemas.microsoft.com/office/drawing/2016/5/13/chartex" xmlns:cx8="http://schemas.microsoft.com/office/drawing/2016/5/14/chartex" xmlns:mc="http://schemas.openxmlformats.org/markup-compatibility/2006" xmlns:aink="http://schemas.microsoft.com/office/drawing/2016/ink" xmlns:am3d="http://schemas.microsoft.com/office/drawing/2017/model3d" xmlns:o="urn:schemas-microsoft-com:office:office" xmlns:oel="http://schemas.microsoft.com/office/2019/extlst" xmlns:r="http://schemas.openxmlformats.org/officeDocument/2006/relationships" xmlns:m="http://schemas.openxmlformats.org/officeDocument/2006/math" xmlns:v="urn:schemas-microsoft-com:vml" xmlns:wp14="http://schemas.microsoft.com/office/word/2010/wordprocessingDrawing" xmlns:wp="http://schemas.openxmlformats.org/drawingml/2006/wordprocessingDrawing" xmlns:w10="urn:schemas-microsoft-com:office:word" xmlns:w="http://schemas.openxmlformats.org/wordprocessingml/2006/main" xmlns:w14="http://schemas.microsoft.com/office/word/2010/wordml" xmlns:w15="http://schemas.microsoft.com/office/word/2012/wordml" xmlns:w16cex="http://schemas.microsoft.com/office/word/2018/wordml/cex" xmlns:w16cid="http://schemas.microsoft.com/office/word/2016/wordml/cid" xmlns:w16="http://schemas.microsoft.com/office/word/2018/wordml" xmlns:w16du="http://schemas.microsoft.com/office/word/2023/wordml/word16du" xmlns:w16sdtdh="http://schemas.microsoft.com/office/word/2020/wordml/sdtdatahash" xmlns:w16sdtfl="http://schemas.microsoft.com/office/word/2024/wordml/sdtformatlock" xmlns:w16se="http://schemas.microsoft.com/office/word/2015/wordml/symex" xmlns:wpg="http://schemas.microsoft.com/office/word/2010/wordprocessingGroup" xmlns:wpi="http://schemas.microsoft.com/office/word/2010/wordprocessingInk" xmlns:wne="http://schemas.microsoft.com/office/word/2006/wordml" xmlns:wps="http://schemas.microsoft.com/office/word/2010/wordprocessingShape" mc:Ignorable="w14 w15 w16se w16cid w16 w16cex w16sdtdh w16sdtfl w16du wp14">
   <w:p>
     <w:pPr>
       <w:pStyle w:val="Encabezado"/>
@@ -3789,7 +3785,7 @@
 </file>
 
 <file path=word/header2.xml><?xml version="1.0" encoding="utf-8"?>
-<w:hdr xmlns:wpc="http://schemas.microsoft.com/office/word/2010/wordprocessingCanvas" xmlns:cx="http://schemas.microsoft.com/office/drawing/2014/chartex" xmlns:cx1="http://schemas.microsoft.com/office/drawing/2015/9/8/chartex" xmlns:cx2="http://schemas.microsoft.com/office/drawing/2015/10/21/chartex" xmlns:cx3="http://schemas.microsoft.com/office/drawing/2016/5/9/chartex" xmlns:cx4="http://schemas.microsoft.com/office/drawing/2016/5/10/chartex" xmlns:cx5="http://schemas.microsoft.com/office/drawing/2016/5/11/chartex" xmlns:cx6="http://schemas.microsoft.com/office/drawing/2016/5/12/chartex" xmlns:cx7="http://schemas.microsoft.com/office/drawing/2016/5/13/chartex" xmlns:cx8="http://schemas.microsoft.com/office/drawing/2016/5/14/chartex" xmlns:mc="http://schemas.openxmlformats.org/markup-compatibility/2006" xmlns:aink="http://schemas.microsoft.com/office/drawing/2016/ink" xmlns:am3d="http://schemas.microsoft.com/office/drawing/2017/model3d" xmlns:o="urn:schemas-microsoft-com:office:office" xmlns:r="http://schemas.openxmlformats.org/officeDocument/2006/relationships" xmlns:m="http://schemas.openxmlformats.org/officeDocument/2006/math" xmlns:v="urn:schemas-microsoft-com:vml" xmlns:wp14="http://schemas.microsoft.com/office/word/2010/wordprocessingDrawing" xmlns:wp="http://schemas.openxmlformats.org/drawingml/2006/wordprocessingDrawing" xmlns:w10="urn:schemas-microsoft-com:office:word" xmlns:w="http://schemas.openxmlformats.org/wordprocessingml/2006/main" xmlns:w14="http://schemas.microsoft.com/office/word/2010/wordml" xmlns:w15="http://schemas.microsoft.com/office/word/2012/wordml" xmlns:w16cid="http://schemas.microsoft.com/office/word/2016/wordml/cid" xmlns:w16se="http://schemas.microsoft.com/office/word/2015/wordml/symex" xmlns:wpg="http://schemas.microsoft.com/office/word/2010/wordprocessingGroup" xmlns:wpi="http://schemas.microsoft.com/office/word/2010/wordprocessingInk" xmlns:wne="http://schemas.microsoft.com/office/word/2006/wordml" xmlns:wps="http://schemas.microsoft.com/office/word/2010/wordprocessingShape" mc:Ignorable="w14 w15 w16se w16cid wp14">
+<w:hdr xmlns:wpc="http://schemas.microsoft.com/office/word/2010/wordprocessingCanvas" xmlns:cx="http://schemas.microsoft.com/office/drawing/2014/chartex" xmlns:cx1="http://schemas.microsoft.com/office/drawing/2015/9/8/chartex" xmlns:cx2="http://schemas.microsoft.com/office/drawing/2015/10/21/chartex" xmlns:cx3="http://schemas.microsoft.com/office/drawing/2016/5/9/chartex" xmlns:cx4="http://schemas.microsoft.com/office/drawing/2016/5/10/chartex" xmlns:cx5="http://schemas.microsoft.com/office/drawing/2016/5/11/chartex" xmlns:cx6="http://schemas.microsoft.com/office/drawing/2016/5/12/chartex" xmlns:cx7="http://schemas.microsoft.com/office/drawing/2016/5/13/chartex" xmlns:cx8="http://schemas.microsoft.com/office/drawing/2016/5/14/chartex" xmlns:mc="http://schemas.openxmlformats.org/markup-compatibility/2006" xmlns:aink="http://schemas.microsoft.com/office/drawing/2016/ink" xmlns:am3d="http://schemas.microsoft.com/office/drawing/2017/model3d" xmlns:o="urn:schemas-microsoft-com:office:office" xmlns:oel="http://schemas.microsoft.com/office/2019/extlst" xmlns:r="http://schemas.openxmlformats.org/officeDocument/2006/relationships" xmlns:m="http://schemas.openxmlformats.org/officeDocument/2006/math" xmlns:v="urn:schemas-microsoft-com:vml" xmlns:wp14="http://schemas.microsoft.com/office/word/2010/wordprocessingDrawing" xmlns:wp="http://schemas.openxmlformats.org/drawingml/2006/wordprocessingDrawing" xmlns:w10="urn:schemas-microsoft-com:office:word" xmlns:w="http://schemas.openxmlformats.org/wordprocessingml/2006/main" xmlns:w14="http://schemas.microsoft.com/office/word/2010/wordml" xmlns:w15="http://schemas.microsoft.com/office/word/2012/wordml" xmlns:w16cex="http://schemas.microsoft.com/office/word/2018/wordml/cex" xmlns:w16cid="http://schemas.microsoft.com/office/word/2016/wordml/cid" xmlns:w16="http://schemas.microsoft.com/office/word/2018/wordml" xmlns:w16du="http://schemas.microsoft.com/office/word/2023/wordml/word16du" xmlns:w16sdtdh="http://schemas.microsoft.com/office/word/2020/wordml/sdtdatahash" xmlns:w16sdtfl="http://schemas.microsoft.com/office/word/2024/wordml/sdtformatlock" xmlns:w16se="http://schemas.microsoft.com/office/word/2015/wordml/symex" xmlns:wpg="http://schemas.microsoft.com/office/word/2010/wordprocessingGroup" xmlns:wpi="http://schemas.microsoft.com/office/word/2010/wordprocessingInk" xmlns:wne="http://schemas.microsoft.com/office/word/2006/wordml" xmlns:wps="http://schemas.microsoft.com/office/word/2010/wordprocessingShape" mc:Ignorable="w14 w15 w16se w16cid w16 w16cex w16sdtdh w16sdtfl w16du wp14">
   <w:p>
     <w:pPr>
       <w:pStyle w:val="Encabezado"/>
@@ -3859,7 +3855,7 @@
 </file>
 
 <file path=word/numbering.xml><?xml version="1.0" encoding="utf-8"?>
-<w:numbering xmlns:wpc="http://schemas.microsoft.com/office/word/2010/wordprocessingCanvas" xmlns:cx="http://schemas.microsoft.com/office/drawing/2014/chartex" xmlns:cx1="http://schemas.microsoft.com/office/drawing/2015/9/8/chartex" xmlns:cx2="http://schemas.microsoft.com/office/drawing/2015/10/21/chartex" xmlns:cx3="http://schemas.microsoft.com/office/drawing/2016/5/9/chartex" xmlns:cx4="http://schemas.microsoft.com/office/drawing/2016/5/10/chartex" xmlns:cx5="http://schemas.microsoft.com/office/drawing/2016/5/11/chartex" xmlns:cx6="http://schemas.microsoft.com/office/drawing/2016/5/12/chartex" xmlns:cx7="http://schemas.microsoft.com/office/drawing/2016/5/13/chartex" xmlns:cx8="http://schemas.microsoft.com/office/drawing/2016/5/14/chartex" xmlns:mc="http://schemas.openxmlformats.org/markup-compatibility/2006" xmlns:aink="http://schemas.microsoft.com/office/drawing/2016/ink" xmlns:am3d="http://schemas.microsoft.com/office/drawing/2017/model3d" xmlns:o="urn:schemas-microsoft-com:office:office" xmlns:r="http://schemas.openxmlformats.org/officeDocument/2006/relationships" xmlns:m="http://schemas.openxmlformats.org/officeDocument/2006/math" xmlns:v="urn:schemas-microsoft-com:vml" xmlns:wp14="http://schemas.microsoft.com/office/word/2010/wordprocessingDrawing" xmlns:wp="http://schemas.openxmlformats.org/drawingml/2006/wordprocessingDrawing" xmlns:w10="urn:schemas-microsoft-com:office:word" xmlns:w="http://schemas.openxmlformats.org/wordprocessingml/2006/main" xmlns:w14="http://schemas.microsoft.com/office/word/2010/wordml" xmlns:w15="http://schemas.microsoft.com/office/word/2012/wordml" xmlns:w16cid="http://schemas.microsoft.com/office/word/2016/wordml/cid" xmlns:w16se="http://schemas.microsoft.com/office/word/2015/wordml/symex" xmlns:wpg="http://schemas.microsoft.com/office/word/2010/wordprocessingGroup" xmlns:wpi="http://schemas.microsoft.com/office/word/2010/wordprocessingInk" xmlns:wne="http://schemas.microsoft.com/office/word/2006/wordml" xmlns:wps="http://schemas.microsoft.com/office/word/2010/wordprocessingShape" mc:Ignorable="w14 w15 w16se w16cid wp14">
+<w:numbering xmlns:wpc="http://schemas.microsoft.com/office/word/2010/wordprocessingCanvas" xmlns:cx="http://schemas.microsoft.com/office/drawing/2014/chartex" xmlns:cx1="http://schemas.microsoft.com/office/drawing/2015/9/8/chartex" xmlns:cx2="http://schemas.microsoft.com/office/drawing/2015/10/21/chartex" xmlns:cx3="http://schemas.microsoft.com/office/drawing/2016/5/9/chartex" xmlns:cx4="http://schemas.microsoft.com/office/drawing/2016/5/10/chartex" xmlns:cx5="http://schemas.microsoft.com/office/drawing/2016/5/11/chartex" xmlns:cx6="http://schemas.microsoft.com/office/drawing/2016/5/12/chartex" xmlns:cx7="http://schemas.microsoft.com/office/drawing/2016/5/13/chartex" xmlns:cx8="http://schemas.microsoft.com/office/drawing/2016/5/14/chartex" xmlns:mc="http://schemas.openxmlformats.org/markup-compatibility/2006" xmlns:aink="http://schemas.microsoft.com/office/drawing/2016/ink" xmlns:am3d="http://schemas.microsoft.com/office/drawing/2017/model3d" xmlns:o="urn:schemas-microsoft-com:office:office" xmlns:oel="http://schemas.microsoft.com/office/2019/extlst" xmlns:r="http://schemas.openxmlformats.org/officeDocument/2006/relationships" xmlns:m="http://schemas.openxmlformats.org/officeDocument/2006/math" xmlns:v="urn:schemas-microsoft-com:vml" xmlns:wp14="http://schemas.microsoft.com/office/word/2010/wordprocessingDrawing" xmlns:wp="http://schemas.openxmlformats.org/drawingml/2006/wordprocessingDrawing" xmlns:w10="urn:schemas-microsoft-com:office:word" xmlns:w="http://schemas.openxmlformats.org/wordprocessingml/2006/main" xmlns:w14="http://schemas.microsoft.com/office/word/2010/wordml" xmlns:w15="http://schemas.microsoft.com/office/word/2012/wordml" xmlns:w16cex="http://schemas.microsoft.com/office/word/2018/wordml/cex" xmlns:w16cid="http://schemas.microsoft.com/office/word/2016/wordml/cid" xmlns:w16="http://schemas.microsoft.com/office/word/2018/wordml" xmlns:w16du="http://schemas.microsoft.com/office/word/2023/wordml/word16du" xmlns:w16sdtdh="http://schemas.microsoft.com/office/word/2020/wordml/sdtdatahash" xmlns:w16sdtfl="http://schemas.microsoft.com/office/word/2024/wordml/sdtformatlock" xmlns:w16se="http://schemas.microsoft.com/office/word/2015/wordml/symex" xmlns:wpg="http://schemas.microsoft.com/office/word/2010/wordprocessingGroup" xmlns:wpi="http://schemas.microsoft.com/office/word/2010/wordprocessingInk" xmlns:wne="http://schemas.microsoft.com/office/word/2006/wordml" xmlns:wps="http://schemas.microsoft.com/office/word/2010/wordprocessingShape" mc:Ignorable="w14 w15 w16se w16cid w16 w16cex w16sdtdh w16sdtfl w16du wp14">
   <w:abstractNum w:abstractNumId="0" w15:restartNumberingAfterBreak="0">
     <w:nsid w:val="0C0130EF"/>
     <w:multiLevelType w:val="hybridMultilevel"/>
@@ -4241,23 +4237,23 @@
       </w:rPr>
     </w:lvl>
   </w:abstractNum>
-  <w:num w:numId="1">
+  <w:num w:numId="1" w16cid:durableId="1688865446">
     <w:abstractNumId w:val="2"/>
   </w:num>
-  <w:num w:numId="2">
+  <w:num w:numId="2" w16cid:durableId="1305963706">
     <w:abstractNumId w:val="3"/>
   </w:num>
-  <w:num w:numId="3">
+  <w:num w:numId="3" w16cid:durableId="2098624212">
     <w:abstractNumId w:val="1"/>
   </w:num>
-  <w:num w:numId="4">
+  <w:num w:numId="4" w16cid:durableId="9993079">
     <w:abstractNumId w:val="0"/>
   </w:num>
 </w:numbering>
 </file>
 
 <file path=word/styles.xml><?xml version="1.0" encoding="utf-8"?>
-<w:styles xmlns:mc="http://schemas.openxmlformats.org/markup-compatibility/2006" xmlns:r="http://schemas.openxmlformats.org/officeDocument/2006/relationships" xmlns:w="http://schemas.openxmlformats.org/wordprocessingml/2006/main" xmlns:w14="http://schemas.microsoft.com/office/word/2010/wordml" xmlns:w15="http://schemas.microsoft.com/office/word/2012/wordml" xmlns:w16cid="http://schemas.microsoft.com/office/word/2016/wordml/cid" xmlns:w16se="http://schemas.microsoft.com/office/word/2015/wordml/symex" mc:Ignorable="w14 w15 w16se w16cid">
+<w:styles xmlns:mc="http://schemas.openxmlformats.org/markup-compatibility/2006" xmlns:r="http://schemas.openxmlformats.org/officeDocument/2006/relationships" xmlns:w="http://schemas.openxmlformats.org/wordprocessingml/2006/main" xmlns:w14="http://schemas.microsoft.com/office/word/2010/wordml" xmlns:w15="http://schemas.microsoft.com/office/word/2012/wordml" xmlns:w16cex="http://schemas.microsoft.com/office/word/2018/wordml/cex" xmlns:w16cid="http://schemas.microsoft.com/office/word/2016/wordml/cid" xmlns:w16="http://schemas.microsoft.com/office/word/2018/wordml" xmlns:w16du="http://schemas.microsoft.com/office/word/2023/wordml/word16du" xmlns:w16sdtdh="http://schemas.microsoft.com/office/word/2020/wordml/sdtdatahash" xmlns:w16sdtfl="http://schemas.microsoft.com/office/word/2024/wordml/sdtformatlock" xmlns:w16se="http://schemas.microsoft.com/office/word/2015/wordml/symex" mc:Ignorable="w14 w15 w16se w16cid w16 w16cex w16sdtdh w16sdtfl w16du">
   <w:docDefaults>
     <w:rPrDefault>
       <w:rPr>
@@ -4275,7 +4271,7 @@
       </w:pPr>
     </w:pPrDefault>
   </w:docDefaults>
-  <w:latentStyles w:defLockedState="0" w:defUIPriority="99" w:defSemiHidden="0" w:defUnhideWhenUsed="0" w:defQFormat="0" w:count="375">
+  <w:latentStyles w:defLockedState="0" w:defUIPriority="99" w:defSemiHidden="0" w:defUnhideWhenUsed="0" w:defQFormat="0" w:count="376">
     <w:lsdException w:name="Normal" w:uiPriority="0" w:qFormat="1"/>
     <w:lsdException w:name="heading 1" w:uiPriority="9" w:qFormat="1"/>
     <w:lsdException w:name="heading 2" w:semiHidden="1" w:uiPriority="9" w:unhideWhenUsed="1" w:qFormat="1"/>
@@ -4651,6 +4647,7 @@
     <w:lsdException w:name="Smart Hyperlink" w:semiHidden="1" w:unhideWhenUsed="1"/>
     <w:lsdException w:name="Hashtag" w:semiHidden="1" w:unhideWhenUsed="1"/>
     <w:lsdException w:name="Unresolved Mention" w:semiHidden="1" w:unhideWhenUsed="1"/>
+    <w:lsdException w:name="Smart Link" w:semiHidden="1" w:unhideWhenUsed="1"/>
   </w:latentStyles>
   <w:style w:type="paragraph" w:default="1" w:styleId="Normal">
     <w:name w:val="Normal"/>

</xml_diff>